<commit_message>
docs: add figures to the internship report
Nine figures rendered as images and embedded at the relevant points:
chunking with overlap, hybrid retrieval with RRF, system architecture,
data model, ingestion flow, query flow, and three results charts built
from the real evaluation numbers (retrieval comparison, learned-vs-hashing
ablation, answer metrics). Replaces the earlier ASCII diagrams; updates the
List of Figures. Rebuilt PDF and DOCX for both the format-compliant report
(77 pp) and the draft.

Co-Authored-By: Claude Opus 4.8 (1M context) <noreply@anthropic.com>
</commit_message>
<xml_diff>
--- a/deliverables/internship_report_7week.docx
+++ b/deliverables/internship_report_7week.docx
@@ -2,14 +2,6 @@
 <file path=word/document.xml><?xml version="1.0" encoding="utf-8"?>
 <w:document xmlns:w="http://schemas.openxmlformats.org/wordprocessingml/2006/main" xmlns:m="http://schemas.openxmlformats.org/officeDocument/2006/math" xmlns:r="http://schemas.openxmlformats.org/officeDocument/2006/relationships" xmlns:o="urn:schemas-microsoft-com:office:office" xmlns:v="urn:schemas-microsoft-com:vml" xmlns:w10="urn:schemas-microsoft-com:office:word" xmlns:a="http://schemas.openxmlformats.org/drawingml/2006/main" xmlns:pic="http://schemas.openxmlformats.org/drawingml/2006/picture" xmlns:wp="http://schemas.openxmlformats.org/drawingml/2006/wordprocessingDrawing">
   <w:body>
-    <w:p>
-      <w:pPr>
-        <w:pStyle w:val="Title"/>
-      </w:pPr>
-      <w:r>
-        <w:t xml:space="preserve">Building a Grounded Retrieval-Augmented Question Answering System: A Seven-Week Internship Report</w:t>
-      </w:r>
-    </w:p>
     <w:sdt>
       <w:sdtPr>
         <w:docPartObj>
@@ -1082,7 +1074,7 @@
     </w:p>
     <w:bookmarkEnd w:id="20"/>
     <w:bookmarkEnd w:id="21"/>
-    <w:bookmarkStart w:id="34" w:name="chapter-2.-background-and-concepts"/>
+    <w:bookmarkStart w:id="40" w:name="chapter-2.-background-and-concepts"/>
     <w:p>
       <w:pPr>
         <w:pStyle w:val="Heading1"/>
@@ -1193,7 +1185,7 @@
       </w:r>
     </w:p>
     <w:bookmarkEnd w:id="24"/>
-    <w:bookmarkStart w:id="25" w:name="chunking"/>
+    <w:bookmarkStart w:id="28" w:name="chunking"/>
     <w:p>
       <w:pPr>
         <w:pStyle w:val="Heading2"/>
@@ -1250,8 +1242,73 @@
         <w:t xml:space="preserve">Overlap deserves a note. If you cut cleanly at a boundary, a fact that straddles the boundary can be split so that neither chunk contains it whole. Repeating a little text from the end of one chunk at the start of the next reduces that risk. It costs some storage and some redundancy in retrieval, which is a price worth paying for a small corpus.</w:t>
       </w:r>
     </w:p>
-    <w:bookmarkEnd w:id="25"/>
-    <w:bookmarkStart w:id="26" w:name="embeddings-and-vector-similarity"/>
+    <w:p>
+      <w:pPr>
+        <w:pStyle w:val="BodyText"/>
+      </w:pPr>
+      <w:r>
+        <w:drawing>
+          <wp:inline>
+            <wp:extent cx="4693920" cy="2152728"/>
+            <wp:effectExtent b="0" l="0" r="0" t="0"/>
+            <wp:docPr descr="" title="" id="26" name="Picture"/>
+            <a:graphic>
+              <a:graphicData uri="http://schemas.openxmlformats.org/drawingml/2006/picture">
+                <pic:pic>
+                  <pic:nvPicPr>
+                    <pic:cNvPr descr="figures/fig1_chunking.png" id="27" name="Picture"/>
+                    <pic:cNvPicPr>
+                      <a:picLocks noChangeArrowheads="1" noChangeAspect="1"/>
+                    </pic:cNvPicPr>
+                  </pic:nvPicPr>
+                  <pic:blipFill>
+                    <a:blip r:embed="rId25"/>
+                    <a:stretch>
+                      <a:fillRect/>
+                    </a:stretch>
+                  </pic:blipFill>
+                  <pic:spPr bwMode="auto">
+                    <a:xfrm>
+                      <a:off x="0" y="0"/>
+                      <a:ext cx="4693920" cy="2152728"/>
+                    </a:xfrm>
+                    <a:prstGeom prst="rect">
+                      <a:avLst/>
+                    </a:prstGeom>
+                    <a:noFill/>
+                    <a:ln w="9525">
+                      <a:noFill/>
+                      <a:headEnd/>
+                      <a:tailEnd/>
+                    </a:ln>
+                  </pic:spPr>
+                </pic:pic>
+              </a:graphicData>
+            </a:graphic>
+          </wp:inline>
+        </w:drawing>
+      </w:r>
+    </w:p>
+    <w:p>
+      <w:pPr>
+        <w:pStyle w:val="BodyText"/>
+      </w:pPr>
+      <w:r>
+        <w:rPr>
+          <w:b/>
+          <w:bCs/>
+        </w:rPr>
+        <w:t xml:space="preserve">Figure 1.</w:t>
+      </w:r>
+      <w:r>
+        <w:t xml:space="preserve"> </w:t>
+      </w:r>
+      <w:r>
+        <w:t xml:space="preserve">Chunking with overlap. A normalised document is split into passages of up to about 900 characters, with roughly 160 characters repeated between neighbours (shaded) so a fact that spans a boundary is not lost.</w:t>
+      </w:r>
+    </w:p>
+    <w:bookmarkEnd w:id="28"/>
+    <w:bookmarkStart w:id="29" w:name="embeddings-and-vector-similarity"/>
     <w:p>
       <w:pPr>
         <w:pStyle w:val="Heading2"/>
@@ -1340,8 +1397,8 @@
         <w:t xml:space="preserve">Learned embedding models are a different story. Reimers and Gurevych (2019) showed with Sentence-BERT that a transformer fine-tuned to produce sentence embeddings can capture paraphrase and semantic similarity far better than earlier methods, and models in that family are what I used for the later experiment. Karpukhin and colleagues (2020) showed, in their work on dense passage retrieval, that learned dense retrieval can beat strong keyword baselines on open-domain question answering, though as I found out, whether it beats them on a small, vocabulary-aligned corpus is a different question.</w:t>
       </w:r>
     </w:p>
-    <w:bookmarkEnd w:id="26"/>
-    <w:bookmarkStart w:id="27" w:name="keyword-retrieval-and-bm25"/>
+    <w:bookmarkEnd w:id="29"/>
+    <w:bookmarkStart w:id="30" w:name="keyword-retrieval-and-bm25"/>
     <w:p>
       <w:pPr>
         <w:pStyle w:val="Heading2"/>
@@ -1374,8 +1431,8 @@
         <w:t xml:space="preserve">Keyword retrieval is strong exactly where embeddings can be weak: exact names, acronyms, dates, identifiers, and technical terms. It is weak where the question and the document use different words for the same thing. That complementarity is the usual argument for combining the two, which is what the next section is about.</w:t>
       </w:r>
     </w:p>
-    <w:bookmarkEnd w:id="27"/>
-    <w:bookmarkStart w:id="28" w:name="X8df179775839a7e5f43874847f80517b786516b"/>
+    <w:bookmarkEnd w:id="30"/>
+    <w:bookmarkStart w:id="34" w:name="X8df179775839a7e5f43874847f80517b786516b"/>
     <w:p>
       <w:pPr>
         <w:pStyle w:val="Heading2"/>
@@ -1408,8 +1465,73 @@
         <w:t xml:space="preserve">The system adds a small extra term based on literal query-term overlap on top of the fused score, which nudged a few borderline cases in the right direction on this corpus. I am honest in Chapter 7 that a term like that should really be tuned on separate data rather than chosen because it helped the numbers I was looking at.</w:t>
       </w:r>
     </w:p>
-    <w:bookmarkEnd w:id="28"/>
-    <w:bookmarkStart w:id="29" w:name="the-evidence-gate-and-refusal"/>
+    <w:p>
+      <w:pPr>
+        <w:pStyle w:val="BodyText"/>
+      </w:pPr>
+      <w:r>
+        <w:drawing>
+          <wp:inline>
+            <wp:extent cx="3307080" cy="2644122"/>
+            <wp:effectExtent b="0" l="0" r="0" t="0"/>
+            <wp:docPr descr="" title="" id="32" name="Picture"/>
+            <a:graphic>
+              <a:graphicData uri="http://schemas.openxmlformats.org/drawingml/2006/picture">
+                <pic:pic>
+                  <pic:nvPicPr>
+                    <pic:cNvPr descr="figures/fig2_retrieval.png" id="33" name="Picture"/>
+                    <pic:cNvPicPr>
+                      <a:picLocks noChangeArrowheads="1" noChangeAspect="1"/>
+                    </pic:cNvPicPr>
+                  </pic:nvPicPr>
+                  <pic:blipFill>
+                    <a:blip r:embed="rId31"/>
+                    <a:stretch>
+                      <a:fillRect/>
+                    </a:stretch>
+                  </pic:blipFill>
+                  <pic:spPr bwMode="auto">
+                    <a:xfrm>
+                      <a:off x="0" y="0"/>
+                      <a:ext cx="3307080" cy="2644122"/>
+                    </a:xfrm>
+                    <a:prstGeom prst="rect">
+                      <a:avLst/>
+                    </a:prstGeom>
+                    <a:noFill/>
+                    <a:ln w="9525">
+                      <a:noFill/>
+                      <a:headEnd/>
+                      <a:tailEnd/>
+                    </a:ln>
+                  </pic:spPr>
+                </pic:pic>
+              </a:graphicData>
+            </a:graphic>
+          </wp:inline>
+        </w:drawing>
+      </w:r>
+    </w:p>
+    <w:p>
+      <w:pPr>
+        <w:pStyle w:val="BodyText"/>
+      </w:pPr>
+      <w:r>
+        <w:rPr>
+          <w:b/>
+          <w:bCs/>
+        </w:rPr>
+        <w:t xml:space="preserve">Figure 2.</w:t>
+      </w:r>
+      <w:r>
+        <w:t xml:space="preserve"> </w:t>
+      </w:r>
+      <w:r>
+        <w:t xml:space="preserve">Hybrid retrieval. The question is scored by keyword ranking (BM25) and by vector similarity independently; the two rankings are combined with Reciprocal Rank Fusion, and the top-k passages are returned.</w:t>
+      </w:r>
+    </w:p>
+    <w:bookmarkEnd w:id="34"/>
+    <w:bookmarkStart w:id="35" w:name="the-evidence-gate-and-refusal"/>
     <w:p>
       <w:pPr>
         <w:pStyle w:val="Heading2"/>
@@ -1446,8 +1568,8 @@
         <w:t xml:space="preserve">There is no single threshold that is right for every embedder and every corpus, and the thresholds this system uses were tuned by hand on the test corpus, which is a real limitation. The most instructive result of the whole internship, described in Chapter 7, is what happened to those thresholds when I changed the embedder underneath them.</w:t>
       </w:r>
     </w:p>
-    <w:bookmarkEnd w:id="29"/>
-    <w:bookmarkStart w:id="30" w:name="citations-and-grounding"/>
+    <w:bookmarkEnd w:id="35"/>
+    <w:bookmarkStart w:id="36" w:name="citations-and-grounding"/>
     <w:p>
       <w:pPr>
         <w:pStyle w:val="Heading2"/>
@@ -1484,8 +1606,8 @@
         <w:t xml:space="preserve">number that looks perfect and means less than it appears to.</w:t>
       </w:r>
     </w:p>
-    <w:bookmarkEnd w:id="30"/>
-    <w:bookmarkStart w:id="31" w:name="evaluating-a-rag-system"/>
+    <w:bookmarkEnd w:id="36"/>
+    <w:bookmarkStart w:id="37" w:name="evaluating-a-rag-system"/>
     <w:p>
       <w:pPr>
         <w:pStyle w:val="Heading2"/>
@@ -1510,8 +1632,8 @@
         <w:t xml:space="preserve">So the evaluation in this project measures retrieval and generation separately. For retrieval it uses standard ranking metrics: Recall at k (is a correct source among the top k results), Mean Reciprocal Rank (how early the first correct result appears), and normalised Discounted Cumulative Gain (a ranking metric that rewards correct results near the top and discounts lower positions). For the answers it uses a fact-coverage measure and separate measures for whether the system refused when it should have and answered when it should have. Chapter 7 defines each of these precisely and reports them. The recurring lesson is that each number measures one narrow thing, and that reading them together, with their limitations in mind, is the only way to get an honest picture.</w:t>
       </w:r>
     </w:p>
-    <w:bookmarkEnd w:id="31"/>
-    <w:bookmarkStart w:id="32" w:name="a-short-note-on-transformers"/>
+    <w:bookmarkEnd w:id="37"/>
+    <w:bookmarkStart w:id="38" w:name="a-short-note-on-transformers"/>
     <w:p>
       <w:pPr>
         <w:pStyle w:val="Heading2"/>
@@ -1536,8 +1658,8 @@
         <w:t xml:space="preserve">For RAG the practical consequence is simple. The model does not search the retrieved passages in any structured way; it attends over them as ordinary text in its context, alongside the instructions and the question. This is why the order and formatting of the retrieved passages in the prompt can matter, and why clearly labelling each passage with a number helps the model cite it. The sentence-embedding models I used for the later experiment are also transformers, fine-tuned so that the vector they produce for a sentence is close to the vectors of sentences with similar meaning, which is the property Reimers and Gurevych (2019) engineered directly.</w:t>
       </w:r>
     </w:p>
-    <w:bookmarkEnd w:id="32"/>
-    <w:bookmarkStart w:id="33" w:name="a-worked-retrieval-example"/>
+    <w:bookmarkEnd w:id="38"/>
+    <w:bookmarkStart w:id="39" w:name="a-worked-retrieval-example"/>
     <w:p>
       <w:pPr>
         <w:pStyle w:val="Heading2"/>
@@ -1640,160 +1762,160 @@
       </w:r>
       <w:r>
         <w:t xml:space="preserve">the keyword side would find little, and on the hashing embedder the vector side would find little either, because it is lexical. A learned embedder would still connect pay to stipend. That single difference is the entire argument for dense retrieval, and it is also why a corpus that never uses different words for the same thing, like the one in this project, does not show the difference.</w:t>
-      </w:r>
-    </w:p>
-    <w:bookmarkEnd w:id="33"/>
-    <w:bookmarkEnd w:id="34"/>
-    <w:bookmarkStart w:id="40" w:name="X8721ac5f12a5091b02d75097d1647c7fd3fcd5e"/>
-    <w:p>
-      <w:pPr>
-        <w:pStyle w:val="Heading1"/>
-      </w:pPr>
-      <w:r>
-        <w:t xml:space="preserve">Chapter 3. Tools and development environment</w:t>
-      </w:r>
-    </w:p>
-    <w:bookmarkStart w:id="35" w:name="language-and-why-python"/>
-    <w:p>
-      <w:pPr>
-        <w:pStyle w:val="Heading2"/>
-      </w:pPr>
-      <w:r>
-        <w:t xml:space="preserve">3.1 Language and why Python</w:t>
-      </w:r>
-    </w:p>
-    <w:p>
-      <w:pPr>
-        <w:pStyle w:val="FirstParagraph"/>
-      </w:pPr>
-      <w:r>
-        <w:t xml:space="preserve">The whole project is written in Python. That was not a difficult choice. The libraries for text processing, web serving, and machine learning that I needed all have mature Python versions, and the optional providers (OpenAI and the sentence-embedding models) ship Python clients first. The environment I worked in had Python 3.9, so I kept the code compatible with 3.9 rather than reaching for newer syntax. That constraint bit me exactly once, described in Chapter 8, when a type-hint style I wanted was not available.</w:t>
-      </w:r>
-    </w:p>
-    <w:bookmarkEnd w:id="35"/>
-    <w:bookmarkStart w:id="36" w:name="the-main-libraries"/>
-    <w:p>
-      <w:pPr>
-        <w:pStyle w:val="Heading2"/>
-      </w:pPr>
-      <w:r>
-        <w:t xml:space="preserve">3.2 The main libraries</w:t>
-      </w:r>
-    </w:p>
-    <w:p>
-      <w:pPr>
-        <w:pStyle w:val="FirstParagraph"/>
-      </w:pPr>
-      <w:r>
-        <w:t xml:space="preserve">The web layer is FastAPI, a Python framework for building HTTP APIs. I chose it because it validates request and response shapes from ordinary Python type hints, which removed a class of bugs where a field is missing or the wrong type, and because it serves static files, so the small web interface and the API could live in one process. The application is run with Uvicorn, the standard server for FastAPI during development.</w:t>
-      </w:r>
-    </w:p>
-    <w:p>
-      <w:pPr>
-        <w:pStyle w:val="BodyText"/>
-      </w:pPr>
-      <w:r>
-        <w:t xml:space="preserve">Storage is SQLite, which is a full relational database that lives in a single file with no separate server process. For a single-user tool that needs to persist an index between runs, it is close to ideal: nothing to install, nothing to keep running, and the file can be deleted to reset the state. I discuss its limits for this use in Chapter 4, because storing vectors in a plain SQL table and scanning them all on every query is fine for a demo and wrong for scale.</w:t>
-      </w:r>
-    </w:p>
-    <w:p>
-      <w:pPr>
-        <w:pStyle w:val="BodyText"/>
-      </w:pPr>
-      <w:r>
-        <w:t xml:space="preserve">For the offline pieces I only needed the Python standard library: hashlib for the hashing embedder, re for tokenising, math for the scoring functions, json for serialising vectors, sqlite3 for storage, and urllib for the Ollama call. Keeping the default install light was a deliberate goal, and it is the reason the heavier dependencies are all optional.</w:t>
-      </w:r>
-    </w:p>
-    <w:p>
-      <w:pPr>
-        <w:pStyle w:val="BodyText"/>
-      </w:pPr>
-      <w:r>
-        <w:t xml:space="preserve">The optional dependencies are pypdf for reading PDF files, the openai package for the OpenAI provider, sentence-transformers for the learned-embedding experiment, and a running Ollama server for local generation. Each of these is imported only when it is actually needed, so a plain installation runs without any of them. Testing uses pytest, and there is a browser test written with Playwright that drives the web interface in a real Chromium browser.</w:t>
-      </w:r>
-    </w:p>
-    <w:bookmarkEnd w:id="36"/>
-    <w:bookmarkStart w:id="37" w:name="repository-layout"/>
-    <w:p>
-      <w:pPr>
-        <w:pStyle w:val="Heading2"/>
-      </w:pPr>
-      <w:r>
-        <w:t xml:space="preserve">3.3 Repository layout</w:t>
-      </w:r>
-    </w:p>
-    <w:p>
-      <w:pPr>
-        <w:pStyle w:val="FirstParagraph"/>
-      </w:pPr>
-      <w:r>
-        <w:t xml:space="preserve">The code is organised so that each concern has one file, which made it easy to test and change pieces in isolation. The backend package holds the settings, text processing, embeddings, storage, retrieval, the language-model adapters, the orchestration service, the API, the data models, and the evaluation and comparison scripts. The frontend folder holds the single HTML page, its stylesheet, and its script. There is a folder of sample documents, a folder of evaluation data and recorded results, a tests folder, a docs folder, and a deliverables folder that holds this report and the presentation.</w:t>
-      </w:r>
-    </w:p>
-    <w:p>
-      <w:pPr>
-        <w:pStyle w:val="BodyText"/>
-      </w:pPr>
-      <w:r>
-        <w:t xml:space="preserve">The project is on GitHub at github.com/archit2501/advanced-rag-llm-app, and the version history there mirrors the week-by-week progress in Chapter 5, since I committed at the end of most working sessions.</w:t>
-      </w:r>
-    </w:p>
-    <w:bookmarkEnd w:id="37"/>
-    <w:bookmarkStart w:id="38" w:name="configuration-and-secrets"/>
-    <w:p>
-      <w:pPr>
-        <w:pStyle w:val="Heading2"/>
-      </w:pPr>
-      <w:r>
-        <w:t xml:space="preserve">3.4 Configuration and secrets</w:t>
-      </w:r>
-    </w:p>
-    <w:p>
-      <w:pPr>
-        <w:pStyle w:val="FirstParagraph"/>
-      </w:pPr>
-      <w:r>
-        <w:t xml:space="preserve">Every value I might want to change without editing code is read from an environment variable, with a sensible default baked in. These include the chunk size and overlap, the number of results to retrieve, the evidence-gate thresholds, the choice of embedding provider and model, the choice of language-model provider, and the API details for the remote providers. There is an example environment file in the repository that lists them all with their defaults.</w:t>
-      </w:r>
-    </w:p>
-    <w:p>
-      <w:pPr>
-        <w:pStyle w:val="BodyText"/>
-      </w:pPr>
-      <w:r>
-        <w:t xml:space="preserve">The one value that must never be committed is the OpenAI API key. It is read from an environment variable and is never written into code, into the frontend, or into any committed file. The example file has the key field blank. I checked before the first push that the real key was not anywhere in the history, because a leaked key in a public repository is the kind of mistake that is expensive and public.</w:t>
-      </w:r>
-    </w:p>
-    <w:bookmarkEnd w:id="38"/>
-    <w:bookmarkStart w:id="39" w:name="how-the-project-is-run"/>
-    <w:p>
-      <w:pPr>
-        <w:pStyle w:val="Heading2"/>
-      </w:pPr>
-      <w:r>
-        <w:t xml:space="preserve">3.5 How the project is run</w:t>
-      </w:r>
-    </w:p>
-    <w:p>
-      <w:pPr>
-        <w:pStyle w:val="FirstParagraph"/>
-      </w:pPr>
-      <w:r>
-        <w:t xml:space="preserve">There are a handful of commands that do everything. One installs the dependencies. One runs the development server and opens the interface in a browser. One runs the unit tests. One runs the answer evaluation over the test questions and writes the results to a file. One runs the retrieval comparison across the three ranking strategies. One runs the browser test against a running server. Wrapping these in short commands mattered more than it sounds, because it meant I could re-run the whole evaluation after any change without remembering a long incantation, and re-running it often is what kept me honest about whether a change actually helped.</w:t>
       </w:r>
     </w:p>
     <w:bookmarkEnd w:id="39"/>
     <w:bookmarkEnd w:id="40"/>
-    <w:bookmarkStart w:id="47" w:name="chapter-4.-system-design"/>
+    <w:bookmarkStart w:id="46" w:name="X8721ac5f12a5091b02d75097d1647c7fd3fcd5e"/>
     <w:p>
       <w:pPr>
         <w:pStyle w:val="Heading1"/>
       </w:pPr>
       <w:r>
+        <w:t xml:space="preserve">Chapter 3. Tools and development environment</w:t>
+      </w:r>
+    </w:p>
+    <w:bookmarkStart w:id="41" w:name="language-and-why-python"/>
+    <w:p>
+      <w:pPr>
+        <w:pStyle w:val="Heading2"/>
+      </w:pPr>
+      <w:r>
+        <w:t xml:space="preserve">3.1 Language and why Python</w:t>
+      </w:r>
+    </w:p>
+    <w:p>
+      <w:pPr>
+        <w:pStyle w:val="FirstParagraph"/>
+      </w:pPr>
+      <w:r>
+        <w:t xml:space="preserve">The whole project is written in Python. That was not a difficult choice. The libraries for text processing, web serving, and machine learning that I needed all have mature Python versions, and the optional providers (OpenAI and the sentence-embedding models) ship Python clients first. The environment I worked in had Python 3.9, so I kept the code compatible with 3.9 rather than reaching for newer syntax. That constraint bit me exactly once, described in Chapter 8, when a type-hint style I wanted was not available.</w:t>
+      </w:r>
+    </w:p>
+    <w:bookmarkEnd w:id="41"/>
+    <w:bookmarkStart w:id="42" w:name="the-main-libraries"/>
+    <w:p>
+      <w:pPr>
+        <w:pStyle w:val="Heading2"/>
+      </w:pPr>
+      <w:r>
+        <w:t xml:space="preserve">3.2 The main libraries</w:t>
+      </w:r>
+    </w:p>
+    <w:p>
+      <w:pPr>
+        <w:pStyle w:val="FirstParagraph"/>
+      </w:pPr>
+      <w:r>
+        <w:t xml:space="preserve">The web layer is FastAPI, a Python framework for building HTTP APIs. I chose it because it validates request and response shapes from ordinary Python type hints, which removed a class of bugs where a field is missing or the wrong type, and because it serves static files, so the small web interface and the API could live in one process. The application is run with Uvicorn, the standard server for FastAPI during development.</w:t>
+      </w:r>
+    </w:p>
+    <w:p>
+      <w:pPr>
+        <w:pStyle w:val="BodyText"/>
+      </w:pPr>
+      <w:r>
+        <w:t xml:space="preserve">Storage is SQLite, which is a full relational database that lives in a single file with no separate server process. For a single-user tool that needs to persist an index between runs, it is close to ideal: nothing to install, nothing to keep running, and the file can be deleted to reset the state. I discuss its limits for this use in Chapter 4, because storing vectors in a plain SQL table and scanning them all on every query is fine for a demo and wrong for scale.</w:t>
+      </w:r>
+    </w:p>
+    <w:p>
+      <w:pPr>
+        <w:pStyle w:val="BodyText"/>
+      </w:pPr>
+      <w:r>
+        <w:t xml:space="preserve">For the offline pieces I only needed the Python standard library: hashlib for the hashing embedder, re for tokenising, math for the scoring functions, json for serialising vectors, sqlite3 for storage, and urllib for the Ollama call. Keeping the default install light was a deliberate goal, and it is the reason the heavier dependencies are all optional.</w:t>
+      </w:r>
+    </w:p>
+    <w:p>
+      <w:pPr>
+        <w:pStyle w:val="BodyText"/>
+      </w:pPr>
+      <w:r>
+        <w:t xml:space="preserve">The optional dependencies are pypdf for reading PDF files, the openai package for the OpenAI provider, sentence-transformers for the learned-embedding experiment, and a running Ollama server for local generation. Each of these is imported only when it is actually needed, so a plain installation runs without any of them. Testing uses pytest, and there is a browser test written with Playwright that drives the web interface in a real Chromium browser.</w:t>
+      </w:r>
+    </w:p>
+    <w:bookmarkEnd w:id="42"/>
+    <w:bookmarkStart w:id="43" w:name="repository-layout"/>
+    <w:p>
+      <w:pPr>
+        <w:pStyle w:val="Heading2"/>
+      </w:pPr>
+      <w:r>
+        <w:t xml:space="preserve">3.3 Repository layout</w:t>
+      </w:r>
+    </w:p>
+    <w:p>
+      <w:pPr>
+        <w:pStyle w:val="FirstParagraph"/>
+      </w:pPr>
+      <w:r>
+        <w:t xml:space="preserve">The code is organised so that each concern has one file, which made it easy to test and change pieces in isolation. The backend package holds the settings, text processing, embeddings, storage, retrieval, the language-model adapters, the orchestration service, the API, the data models, and the evaluation and comparison scripts. The frontend folder holds the single HTML page, its stylesheet, and its script. There is a folder of sample documents, a folder of evaluation data and recorded results, a tests folder, a docs folder, and a deliverables folder that holds this report and the presentation.</w:t>
+      </w:r>
+    </w:p>
+    <w:p>
+      <w:pPr>
+        <w:pStyle w:val="BodyText"/>
+      </w:pPr>
+      <w:r>
+        <w:t xml:space="preserve">The project is on GitHub at github.com/archit2501/advanced-rag-llm-app, and the version history there mirrors the week-by-week progress in Chapter 5, since I committed at the end of most working sessions.</w:t>
+      </w:r>
+    </w:p>
+    <w:bookmarkEnd w:id="43"/>
+    <w:bookmarkStart w:id="44" w:name="configuration-and-secrets"/>
+    <w:p>
+      <w:pPr>
+        <w:pStyle w:val="Heading2"/>
+      </w:pPr>
+      <w:r>
+        <w:t xml:space="preserve">3.4 Configuration and secrets</w:t>
+      </w:r>
+    </w:p>
+    <w:p>
+      <w:pPr>
+        <w:pStyle w:val="FirstParagraph"/>
+      </w:pPr>
+      <w:r>
+        <w:t xml:space="preserve">Every value I might want to change without editing code is read from an environment variable, with a sensible default baked in. These include the chunk size and overlap, the number of results to retrieve, the evidence-gate thresholds, the choice of embedding provider and model, the choice of language-model provider, and the API details for the remote providers. There is an example environment file in the repository that lists them all with their defaults.</w:t>
+      </w:r>
+    </w:p>
+    <w:p>
+      <w:pPr>
+        <w:pStyle w:val="BodyText"/>
+      </w:pPr>
+      <w:r>
+        <w:t xml:space="preserve">The one value that must never be committed is the OpenAI API key. It is read from an environment variable and is never written into code, into the frontend, or into any committed file. The example file has the key field blank. I checked before the first push that the real key was not anywhere in the history, because a leaked key in a public repository is the kind of mistake that is expensive and public.</w:t>
+      </w:r>
+    </w:p>
+    <w:bookmarkEnd w:id="44"/>
+    <w:bookmarkStart w:id="45" w:name="how-the-project-is-run"/>
+    <w:p>
+      <w:pPr>
+        <w:pStyle w:val="Heading2"/>
+      </w:pPr>
+      <w:r>
+        <w:t xml:space="preserve">3.5 How the project is run</w:t>
+      </w:r>
+    </w:p>
+    <w:p>
+      <w:pPr>
+        <w:pStyle w:val="FirstParagraph"/>
+      </w:pPr>
+      <w:r>
+        <w:t xml:space="preserve">There are a handful of commands that do everything. One installs the dependencies. One runs the development server and opens the interface in a browser. One runs the unit tests. One runs the answer evaluation over the test questions and writes the results to a file. One runs the retrieval comparison across the three ranking strategies. One runs the browser test against a running server. Wrapping these in short commands mattered more than it sounds, because it meant I could re-run the whole evaluation after any change without remembering a long incantation, and re-running it often is what kept me honest about whether a change actually helped.</w:t>
+      </w:r>
+    </w:p>
+    <w:bookmarkEnd w:id="45"/>
+    <w:bookmarkEnd w:id="46"/>
+    <w:bookmarkStart w:id="59" w:name="chapter-4.-system-design"/>
+    <w:p>
+      <w:pPr>
+        <w:pStyle w:val="Heading1"/>
+      </w:pPr>
+      <w:r>
         <w:t xml:space="preserve">Chapter 4. System design</w:t>
       </w:r>
     </w:p>
-    <w:bookmarkStart w:id="41" w:name="design-principles"/>
+    <w:bookmarkStart w:id="47" w:name="design-principles"/>
     <w:p>
       <w:pPr>
         <w:pStyle w:val="Heading2"/>
@@ -1834,8 +1956,8 @@
         <w:t xml:space="preserve">The third was that the pieces should be swappable. The embedder, the language-model provider, and the storage are all reached through a narrow interface, so that one can be replaced without touching the rest. The learned-embedding experiment in Chapter 7 only took an afternoon precisely because the embedder was already behind such an interface, and that afternoon paid back the effort of building the interface earlier.</w:t>
       </w:r>
     </w:p>
-    <w:bookmarkEnd w:id="41"/>
-    <w:bookmarkStart w:id="42" w:name="the-pipeline"/>
+    <w:bookmarkEnd w:id="47"/>
+    <w:bookmarkStart w:id="51" w:name="the-pipeline"/>
     <w:p>
       <w:pPr>
         <w:pStyle w:val="Heading2"/>
@@ -1860,8 +1982,73 @@
         <w:t xml:space="preserve">The value of this separation showed up constantly during debugging. When a question returned a wrong answer, I could look at each stage’s output in turn and find the one that was responsible, rather than guessing at the whole thing as a black box.</w:t>
       </w:r>
     </w:p>
-    <w:bookmarkEnd w:id="42"/>
-    <w:bookmarkStart w:id="43" w:name="the-data-model"/>
+    <w:p>
+      <w:pPr>
+        <w:pStyle w:val="BodyText"/>
+      </w:pPr>
+      <w:r>
+        <w:drawing>
+          <wp:inline>
+            <wp:extent cx="5067300" cy="2255207"/>
+            <wp:effectExtent b="0" l="0" r="0" t="0"/>
+            <wp:docPr descr="" title="" id="49" name="Picture"/>
+            <a:graphic>
+              <a:graphicData uri="http://schemas.openxmlformats.org/drawingml/2006/picture">
+                <pic:pic>
+                  <pic:nvPicPr>
+                    <pic:cNvPr descr="figures/fig3_architecture.png" id="50" name="Picture"/>
+                    <pic:cNvPicPr>
+                      <a:picLocks noChangeArrowheads="1" noChangeAspect="1"/>
+                    </pic:cNvPicPr>
+                  </pic:nvPicPr>
+                  <pic:blipFill>
+                    <a:blip r:embed="rId48"/>
+                    <a:stretch>
+                      <a:fillRect/>
+                    </a:stretch>
+                  </pic:blipFill>
+                  <pic:spPr bwMode="auto">
+                    <a:xfrm>
+                      <a:off x="0" y="0"/>
+                      <a:ext cx="5067300" cy="2255207"/>
+                    </a:xfrm>
+                    <a:prstGeom prst="rect">
+                      <a:avLst/>
+                    </a:prstGeom>
+                    <a:noFill/>
+                    <a:ln w="9525">
+                      <a:noFill/>
+                      <a:headEnd/>
+                      <a:tailEnd/>
+                    </a:ln>
+                  </pic:spPr>
+                </pic:pic>
+              </a:graphicData>
+            </a:graphic>
+          </wp:inline>
+        </w:drawing>
+      </w:r>
+    </w:p>
+    <w:p>
+      <w:pPr>
+        <w:pStyle w:val="BodyText"/>
+      </w:pPr>
+      <w:r>
+        <w:rPr>
+          <w:b/>
+          <w:bCs/>
+        </w:rPr>
+        <w:t xml:space="preserve">Figure 3.</w:t>
+      </w:r>
+      <w:r>
+        <w:t xml:space="preserve"> </w:t>
+      </w:r>
+      <w:r>
+        <w:t xml:space="preserve">The system architecture. The ingestion path runs when a document is added; the query path runs when a question is asked. Storage feeds the retrieval stage with the stored passages.</w:t>
+      </w:r>
+    </w:p>
+    <w:bookmarkEnd w:id="51"/>
+    <w:bookmarkStart w:id="55" w:name="the-data-model"/>
     <w:p>
       <w:pPr>
         <w:pStyle w:val="Heading2"/>
@@ -1886,8 +2073,73 @@
         <w:t xml:space="preserve">Two design choices in this model are worth calling out. The document identifier is derived from the filename and the content by hashing them, so re-ingesting the same file produces the same identifier and replaces the old copy instead of creating a duplicate. And every passage carries enough provenance (its document, source, and position) that a citation can be built from it directly. Provenance is not a nice-to-have here; it is the thing that makes citations possible at all.</w:t>
       </w:r>
     </w:p>
-    <w:bookmarkEnd w:id="43"/>
-    <w:bookmarkStart w:id="44" w:name="the-two-main-flows"/>
+    <w:p>
+      <w:pPr>
+        <w:pStyle w:val="BodyText"/>
+      </w:pPr>
+      <w:r>
+        <w:drawing>
+          <wp:inline>
+            <wp:extent cx="4533900" cy="1898570"/>
+            <wp:effectExtent b="0" l="0" r="0" t="0"/>
+            <wp:docPr descr="" title="" id="53" name="Picture"/>
+            <a:graphic>
+              <a:graphicData uri="http://schemas.openxmlformats.org/drawingml/2006/picture">
+                <pic:pic>
+                  <pic:nvPicPr>
+                    <pic:cNvPr descr="figures/fig4_datamodel.png" id="54" name="Picture"/>
+                    <pic:cNvPicPr>
+                      <a:picLocks noChangeArrowheads="1" noChangeAspect="1"/>
+                    </pic:cNvPicPr>
+                  </pic:nvPicPr>
+                  <pic:blipFill>
+                    <a:blip r:embed="rId52"/>
+                    <a:stretch>
+                      <a:fillRect/>
+                    </a:stretch>
+                  </pic:blipFill>
+                  <pic:spPr bwMode="auto">
+                    <a:xfrm>
+                      <a:off x="0" y="0"/>
+                      <a:ext cx="4533900" cy="1898570"/>
+                    </a:xfrm>
+                    <a:prstGeom prst="rect">
+                      <a:avLst/>
+                    </a:prstGeom>
+                    <a:noFill/>
+                    <a:ln w="9525">
+                      <a:noFill/>
+                      <a:headEnd/>
+                      <a:tailEnd/>
+                    </a:ln>
+                  </pic:spPr>
+                </pic:pic>
+              </a:graphicData>
+            </a:graphic>
+          </wp:inline>
+        </w:drawing>
+      </w:r>
+    </w:p>
+    <w:p>
+      <w:pPr>
+        <w:pStyle w:val="BodyText"/>
+      </w:pPr>
+      <w:r>
+        <w:rPr>
+          <w:b/>
+          <w:bCs/>
+        </w:rPr>
+        <w:t xml:space="preserve">Figure 4.</w:t>
+      </w:r>
+      <w:r>
+        <w:t xml:space="preserve"> </w:t>
+      </w:r>
+      <w:r>
+        <w:t xml:space="preserve">The data model. Each document has many chunks; every chunk stores its text, its embedding as JSON, its metadata, and the provenance fields needed to build a citation.</w:t>
+      </w:r>
+    </w:p>
+    <w:bookmarkEnd w:id="55"/>
+    <w:bookmarkStart w:id="56" w:name="the-two-main-flows"/>
     <w:p>
       <w:pPr>
         <w:pStyle w:val="Heading2"/>
@@ -1912,8 +2164,8 @@
         <w:t xml:space="preserve">I have drawn both flows out in Chapter 6 alongside the code, because the flows and the modules line up almost one to one, which is a sign the design held together.</w:t>
       </w:r>
     </w:p>
-    <w:bookmarkEnd w:id="44"/>
-    <w:bookmarkStart w:id="45" w:name="storage-an-honest-note-on-the-word-index"/>
+    <w:bookmarkEnd w:id="56"/>
+    <w:bookmarkStart w:id="57" w:name="storage-an-honest-note-on-the-word-index"/>
     <w:p>
       <w:pPr>
         <w:pStyle w:val="Heading2"/>
@@ -1956,8 +2208,8 @@
         <w:t xml:space="preserve">For the corpus in this project, which is about 29 passages, the difference does not matter; the scan takes a few milliseconds. But calling it an index would imply a scaling property it does not have, and a reader who took that at face value would be misled. So the documentation now calls it a linear-scan vector store, and Chapter 10 lists moving to a real approximate-nearest-neighbour index as the first thing I would change for a larger corpus. I am spending a paragraph on a single word because the habit of naming things accurately, even when the accurate name is less impressive, was one of the more useful things I picked up this summer.</w:t>
       </w:r>
     </w:p>
-    <w:bookmarkEnd w:id="45"/>
-    <w:bookmarkStart w:id="46" w:name="provider-abstraction"/>
+    <w:bookmarkEnd w:id="57"/>
+    <w:bookmarkStart w:id="58" w:name="provider-abstraction"/>
     <w:p>
       <w:pPr>
         <w:pStyle w:val="Heading2"/>
@@ -1982,9 +2234,9 @@
         <w:t xml:space="preserve">This is a standard pattern, but building it early was one of the better calls I made, for a reason I did not anticipate. It forced the offline mode to be a first-class provider rather than a fallback, which meant the whole pipeline, including citation handling, was exercised by the default path and by the tests. If the offline mode had been an afterthought, a lot of bugs would have hidden until the first time someone ran it without a key.</w:t>
       </w:r>
     </w:p>
-    <w:bookmarkEnd w:id="46"/>
-    <w:bookmarkEnd w:id="47"/>
-    <w:bookmarkStart w:id="55" w:name="chapter-5.-week-by-week-account"/>
+    <w:bookmarkEnd w:id="58"/>
+    <w:bookmarkEnd w:id="59"/>
+    <w:bookmarkStart w:id="67" w:name="chapter-5.-week-by-week-account"/>
     <w:p>
       <w:pPr>
         <w:pStyle w:val="Heading1"/>
@@ -2001,7 +2253,7 @@
         <w:t xml:space="preserve">This is the longest chapter and the most honest one. I kept a working log through the internship, partly because my mentor asked for it and partly because I found I could not remember on Friday what I had been stuck on Tuesday. What follows is that log, cleaned up but not sanitised. I have left the dead ends in, because the dead ends are where I learned the most.</w:t>
       </w:r>
     </w:p>
-    <w:bookmarkStart w:id="48" w:name="week-1-1923-may-scoping-and-reading"/>
+    <w:bookmarkStart w:id="60" w:name="week-1-1923-may-scoping-and-reading"/>
     <w:p>
       <w:pPr>
         <w:pStyle w:val="Heading2"/>
@@ -2086,8 +2338,8 @@
         <w:t xml:space="preserve">had an answer, because I had set up the measurement first. The weeks where I ignored that lesson are visible below.</w:t>
       </w:r>
     </w:p>
-    <w:bookmarkEnd w:id="48"/>
-    <w:bookmarkStart w:id="49" w:name="week-2-2630-may-ingestion-and-storage"/>
+    <w:bookmarkEnd w:id="60"/>
+    <w:bookmarkStart w:id="61" w:name="week-2-2630-may-ingestion-and-storage"/>
     <w:p>
       <w:pPr>
         <w:pStyle w:val="Heading2"/>
@@ -2136,8 +2388,8 @@
         <w:t xml:space="preserve">Storage was the calmer half of the week. I set up the SQLite schema with a documents table and a chunks table, wrote the code to insert a document and its chunks in one transaction, and made re-ingesting a file replace its old chunks rather than duplicate them, using the content-derived identifier from Chapter 4. I stored each embedding as a JSON array of numbers in a text column. At the time this seemed obviously fine. It is fine for this corpus. It is also the root of the scaling limitation I discuss later, because it means every query re-parses every vector from text, and I want to be clear that I did not appreciate that cost in week two. It only became visible when I measured latency in week seven with a heavier embedder.</w:t>
       </w:r>
     </w:p>
-    <w:bookmarkEnd w:id="49"/>
-    <w:bookmarkStart w:id="50" w:name="week-3-26-june-retrieval"/>
+    <w:bookmarkEnd w:id="61"/>
+    <w:bookmarkStart w:id="62" w:name="week-3-26-june-retrieval"/>
     <w:p>
       <w:pPr>
         <w:pStyle w:val="Heading2"/>
@@ -2254,8 +2506,8 @@
         <w:t xml:space="preserve">The rest of week three was making retrieval debuggable. Each result carries its fused score, its vector score, its keyword score, its term overlap, and its rank. This felt like over-engineering at the time. It was not. In weeks five and six, almost every time a question returned the wrong passage, I found the cause by reading those five numbers, and I would not have found it by staring at the final answer.</w:t>
       </w:r>
     </w:p>
-    <w:bookmarkEnd w:id="50"/>
-    <w:bookmarkStart w:id="51" w:name="Xff46fda214ed7d391c2b010389a62a175f1cd74"/>
+    <w:bookmarkEnd w:id="62"/>
+    <w:bookmarkStart w:id="63" w:name="Xff46fda214ed7d391c2b010389a62a175f1cd74"/>
     <w:p>
       <w:pPr>
         <w:pStyle w:val="Heading2"/>
@@ -2336,8 +2588,8 @@
         <w:t xml:space="preserve">metric a perfect 1.0. It also made that metric meaningless, because the coverage was manufactured by the code rather than earned by the model. I did not catch this in week four. It was caught in the code review in week six, and removing it is described there. I mention it here so the timeline is honest: the mistake was made in week four and lived in the code for two weeks before anyone noticed.</w:t>
       </w:r>
     </w:p>
-    <w:bookmarkEnd w:id="51"/>
-    <w:bookmarkStart w:id="52" w:name="Xee4c1d079f2bc65dbaf0104abab29d276d08fdb"/>
+    <w:bookmarkEnd w:id="63"/>
+    <w:bookmarkStart w:id="64" w:name="Xee4c1d079f2bc65dbaf0104abab29d276d08fdb"/>
     <w:p>
       <w:pPr>
         <w:pStyle w:val="Heading2"/>
@@ -2402,8 +2654,8 @@
         <w:t xml:space="preserve">I also wrote the browser test this week, which drives the interface in a real Chromium browser: it loads the page, clears the index, uploads a document, loads the samples, asks a question, checks that citations and sources appear, runs the evaluation, and checks for console errors and layout overflow on a narrow screen. It is not a test of answer quality, but it catches the class of bug where the backend is fine and the interface is broken, which unit tests miss entirely.</w:t>
       </w:r>
     </w:p>
-    <w:bookmarkEnd w:id="52"/>
-    <w:bookmarkStart w:id="53" w:name="Xea8bf8542d0172029272242f7c31de3defc1d7e"/>
+    <w:bookmarkEnd w:id="64"/>
+    <w:bookmarkStart w:id="65" w:name="Xea8bf8542d0172029272242f7c31de3defc1d7e"/>
     <w:p>
       <w:pPr>
         <w:pStyle w:val="Heading2"/>
@@ -2524,8 +2776,8 @@
         <w:t xml:space="preserve">None of these were fun to receive. All of them were fair. The lesson I took from the review is that the first version of code that passes its own tests is not finished; it is the version that passes the tests you thought to write, and a second reader will find the assumptions you could not see. I would now ask for a review much earlier.</w:t>
       </w:r>
     </w:p>
-    <w:bookmarkEnd w:id="53"/>
-    <w:bookmarkStart w:id="54" w:name="X99a99aa2e0e807c58ee9e492103bfa193185a63"/>
+    <w:bookmarkEnd w:id="65"/>
+    <w:bookmarkStart w:id="66" w:name="X99a99aa2e0e807c58ee9e492103bfa193185a63"/>
     <w:p>
       <w:pPr>
         <w:pStyle w:val="Heading2"/>
@@ -2610,9 +2862,9 @@
         <w:t xml:space="preserve">On the last day I re-read my week-one sticky note. All eight objectives were done. The one that had looked easiest in week one, refusing when the evidence is weak, had turned out to be the deepest, and the experiment that failed had taught me more than the ones that worked. That felt like the right note to end on.</w:t>
       </w:r>
     </w:p>
-    <w:bookmarkEnd w:id="54"/>
-    <w:bookmarkEnd w:id="55"/>
-    <w:bookmarkStart w:id="66" w:name="chapter-6.-implementation"/>
+    <w:bookmarkEnd w:id="66"/>
+    <w:bookmarkEnd w:id="67"/>
+    <w:bookmarkStart w:id="78" w:name="chapter-6.-implementation"/>
     <w:p>
       <w:pPr>
         <w:pStyle w:val="Heading1"/>
@@ -2629,7 +2881,7 @@
         <w:t xml:space="preserve">This chapter walks through the code module by module. It repeats a little of the design from Chapter 4, but here the focus is on how each part actually works, with the real algorithms and a few short excerpts. The modules line up with the pipeline: configuration, ingestion, embeddings, storage, retrieval, generation, orchestration, the API, and the frontend.</w:t>
       </w:r>
     </w:p>
-    <w:bookmarkStart w:id="56" w:name="configuration"/>
+    <w:bookmarkStart w:id="68" w:name="configuration"/>
     <w:p>
       <w:pPr>
         <w:pStyle w:val="Heading2"/>
@@ -2654,8 +2906,8 @@
         <w:t xml:space="preserve">Two small helpers read integer and float values from the environment and fall back to the default if the value is missing or malformed, so a typo in an environment variable degrades to the default rather than crashing the service. A full table of the variables and their defaults is in Appendix A.</w:t>
       </w:r>
     </w:p>
-    <w:bookmarkEnd w:id="56"/>
-    <w:bookmarkStart w:id="57" w:name="ingestion-and-chunking"/>
+    <w:bookmarkEnd w:id="68"/>
+    <w:bookmarkStart w:id="69" w:name="ingestion-and-chunking"/>
     <w:p>
       <w:pPr>
         <w:pStyle w:val="Heading2"/>
@@ -3274,8 +3526,8 @@
         <w:t xml:space="preserve">The branch at the top is the fix from week two: a paragraph longer than the whole chunk size is split on word boundaries instead of becoming one oversized chunk. The rest packs paragraphs and carries a tail overlap when it starts a new piece.</w:t>
       </w:r>
     </w:p>
-    <w:bookmarkEnd w:id="57"/>
-    <w:bookmarkStart w:id="58" w:name="embeddings"/>
+    <w:bookmarkEnd w:id="69"/>
+    <w:bookmarkStart w:id="70" w:name="embeddings"/>
     <w:p>
       <w:pPr>
         <w:pStyle w:val="Heading2"/>
@@ -3464,8 +3716,8 @@
         <w:t xml:space="preserve">Similarity is cosine similarity, which for unit-length vectors is a dot product. The retrieval code clamps negative vector scores to zero so that a negative dot product does not act as a relevance signal.</w:t>
       </w:r>
     </w:p>
-    <w:bookmarkEnd w:id="58"/>
-    <w:bookmarkStart w:id="59" w:name="storage"/>
+    <w:bookmarkEnd w:id="70"/>
+    <w:bookmarkStart w:id="71" w:name="storage"/>
     <w:p>
       <w:pPr>
         <w:pStyle w:val="Heading2"/>
@@ -3502,8 +3754,8 @@
         <w:t xml:space="preserve">anywhere in the code or the docs.</w:t>
       </w:r>
     </w:p>
-    <w:bookmarkEnd w:id="59"/>
-    <w:bookmarkStart w:id="60" w:name="retrieval"/>
+    <w:bookmarkEnd w:id="71"/>
+    <w:bookmarkStart w:id="72" w:name="retrieval"/>
     <w:p>
       <w:pPr>
         <w:pStyle w:val="Heading2"/>
@@ -3854,8 +4106,8 @@
         <w:t xml:space="preserve">with the usual constants k1 = 1.5 and b = 0.75. The fusion is one over sixty plus the rank, summed across the two signals, with a term-overlap bonus added on top. Each result keeps all of its component scores and its rank, which is the diagnostic information that made debugging retrieval tractable.</w:t>
       </w:r>
     </w:p>
-    <w:bookmarkEnd w:id="60"/>
-    <w:bookmarkStart w:id="61" w:name="the-evidence-gate"/>
+    <w:bookmarkEnd w:id="72"/>
+    <w:bookmarkStart w:id="73" w:name="the-evidence-gate"/>
     <w:p>
       <w:pPr>
         <w:pStyle w:val="Heading2"/>
@@ -3872,8 +4124,8 @@
         <w:t xml:space="preserve">The gate is a single method on the orchestration service. It refuses when there are no results, or when the top result is weak on all four signals at once: a low fused score, a low vector score, low term overlap, and a low keyword score. The thresholds are configuration values with defaults that were tuned on the test corpus. As Chapter 7 shows, those defaults are tied to the hashing embedder’s score scale and do not transfer to a different embedder, which is the project’s central caution about evidence gating.</w:t>
       </w:r>
     </w:p>
-    <w:bookmarkEnd w:id="61"/>
-    <w:bookmarkStart w:id="62" w:name="generation-and-citations"/>
+    <w:bookmarkEnd w:id="73"/>
+    <w:bookmarkStart w:id="74" w:name="generation-and-citations"/>
     <w:p>
       <w:pPr>
         <w:pStyle w:val="Heading2"/>
@@ -3910,8 +4162,8 @@
         <w:t xml:space="preserve">flag in the diagnostics. This is the corrected behaviour from week six; the earlier code fabricated a citation here, which is exactly what a citation-handling module should not do.</w:t>
       </w:r>
     </w:p>
-    <w:bookmarkEnd w:id="62"/>
-    <w:bookmarkStart w:id="63" w:name="orchestration"/>
+    <w:bookmarkEnd w:id="74"/>
+    <w:bookmarkStart w:id="75" w:name="orchestration"/>
     <w:p>
       <w:pPr>
         <w:pStyle w:val="Heading2"/>
@@ -3928,8 +4180,8 @@
         <w:t xml:space="preserve">The orchestration service ties the pipeline together. On ingestion it extracts, identifies, chunks, embeds, and stores. On a question it validates the input, loads the passages, retrieves, applies the gate, and either refuses or generates, then validates citations and assembles the response. The response carries the answer, the citations, the full source list, and the diagnostics, which include the provider, the passage counts, the top-k setting, whether the system refused, whether the answer was uncited, and the latency. Carrying the diagnostics all the way out to the caller is what makes the system inspectable rather than a black box.</w:t>
       </w:r>
     </w:p>
-    <w:bookmarkEnd w:id="63"/>
-    <w:bookmarkStart w:id="64" w:name="the-api-and-frontend"/>
+    <w:bookmarkEnd w:id="75"/>
+    <w:bookmarkStart w:id="76" w:name="the-api-and-frontend"/>
     <w:p>
       <w:pPr>
         <w:pStyle w:val="Heading2"/>
@@ -3954,8 +4206,8 @@
         <w:t xml:space="preserve">The frontend is one page of plain HTML, CSS, and JavaScript. It provides the controls for uploading, asking, and evaluating, and it renders the answer with its citations and the sources with their scores and excerpts. Every value from the server is escaped before it is inserted into the page, so document content cannot inject markup.</w:t>
       </w:r>
     </w:p>
-    <w:bookmarkEnd w:id="64"/>
-    <w:bookmarkStart w:id="65" w:name="tests"/>
+    <w:bookmarkEnd w:id="76"/>
+    <w:bookmarkStart w:id="77" w:name="tests"/>
     <w:p>
       <w:pPr>
         <w:pStyle w:val="Heading2"/>
@@ -3972,9 +4224,9 @@
         <w:t xml:space="preserve">The test suite covers the parts most likely to break silently: chunking, ingestion through to an answer, the evaluation logic, the retrieval comparison, the low-evidence refusal, and the OpenAI adapter with a mocked client so no real call is made. There are nine tests, and they run in under a second, which mattered because I ran them after almost every change. The browser test is separate and drives the real interface. Tests do not prove the answers are good; they prove the plumbing holds, which is a different and necessary thing.</w:t>
       </w:r>
     </w:p>
-    <w:bookmarkEnd w:id="65"/>
-    <w:bookmarkEnd w:id="66"/>
-    <w:bookmarkStart w:id="73" w:name="chapter-7.-evaluation-and-results"/>
+    <w:bookmarkEnd w:id="77"/>
+    <w:bookmarkEnd w:id="78"/>
+    <w:bookmarkStart w:id="94" w:name="chapter-7.-evaluation-and-results"/>
     <w:p>
       <w:pPr>
         <w:pStyle w:val="Heading1"/>
@@ -3991,7 +4243,7 @@
         <w:t xml:space="preserve">This chapter reports what the system actually does on the test set. I want to be careful here, because it is the chapter most tempting to oversell, and my supervisor’s standing instruction was to treat every good number as guilty until proven innocent. So each result comes with what it does and does not show.</w:t>
       </w:r>
     </w:p>
-    <w:bookmarkStart w:id="67" w:name="why-the-evaluation-is-split"/>
+    <w:bookmarkStart w:id="79" w:name="why-the-evaluation-is-split"/>
     <w:p>
       <w:pPr>
         <w:pStyle w:val="Heading2"/>
@@ -4008,8 +4260,8 @@
         <w:t xml:space="preserve">A RAG system has two stages that fail independently, so a single number cannot describe it. Retrieval can find the right passage and the generator can still write a poor answer; the generator can write a fluent answer while retrieval missed the fact. Measuring only the final answer hides which stage is at fault. The evaluation therefore reports retrieval metrics and answer metrics separately, and I read them together.</w:t>
       </w:r>
     </w:p>
-    <w:bookmarkEnd w:id="67"/>
-    <w:bookmarkStart w:id="68" w:name="the-test-set"/>
+    <w:bookmarkEnd w:id="79"/>
+    <w:bookmarkStart w:id="80" w:name="the-test-set"/>
     <w:p>
       <w:pPr>
         <w:pStyle w:val="Heading2"/>
@@ -4034,8 +4286,8 @@
         <w:t xml:space="preserve">I should state the obvious limitation plainly: this is a small, synthetic, hand-written corpus. It is good for guiding engineering decisions and for catching regressions. It is not a held-out real-world benchmark, and no number here should be read as evidence that the system would perform the same on real documents at scale. A proper research claim would need separate tuning and test splits that are not reused, and human-reviewed relevance labels.</w:t>
       </w:r>
     </w:p>
-    <w:bookmarkEnd w:id="68"/>
-    <w:bookmarkStart w:id="69" w:name="the-metrics-defined"/>
+    <w:bookmarkEnd w:id="80"/>
+    <w:bookmarkStart w:id="81" w:name="the-metrics-defined"/>
     <w:p>
       <w:pPr>
         <w:pStyle w:val="Heading2"/>
@@ -4076,8 +4328,8 @@
         <w:t xml:space="preserve">For retrieval, Recall at 5 asks whether an expected source is among the top five retrieved sources. Mean Reciprocal Rank rewards the first correct source appearing early. Normalised Discounted Cumulative Gain at 5 rewards correct sources near the top and normalises against the ideal ordering. The comparison judges at the level of source documents, because that is what the labels record. The combined benchmark score is a project-defined blend of ranking and abstention, useful for picking a baseline on this corpus and not meant as a universal standard.</w:t>
       </w:r>
     </w:p>
-    <w:bookmarkEnd w:id="69"/>
-    <w:bookmarkStart w:id="70" w:name="results-with-the-default-embedder"/>
+    <w:bookmarkEnd w:id="81"/>
+    <w:bookmarkStart w:id="85" w:name="results-with-the-default-embedder"/>
     <w:p>
       <w:pPr>
         <w:pStyle w:val="Heading2"/>
@@ -4631,6 +4883,71 @@
         <w:pStyle w:val="BodyText"/>
       </w:pPr>
       <w:r>
+        <w:drawing>
+          <wp:inline>
+            <wp:extent cx="4267200" cy="2455622"/>
+            <wp:effectExtent b="0" l="0" r="0" t="0"/>
+            <wp:docPr descr="" title="" id="83" name="Picture"/>
+            <a:graphic>
+              <a:graphicData uri="http://schemas.openxmlformats.org/drawingml/2006/picture">
+                <pic:pic>
+                  <pic:nvPicPr>
+                    <pic:cNvPr descr="figures/fig7_retrieval_comparison.png" id="84" name="Picture"/>
+                    <pic:cNvPicPr>
+                      <a:picLocks noChangeArrowheads="1" noChangeAspect="1"/>
+                    </pic:cNvPicPr>
+                  </pic:nvPicPr>
+                  <pic:blipFill>
+                    <a:blip r:embed="rId82"/>
+                    <a:stretch>
+                      <a:fillRect/>
+                    </a:stretch>
+                  </pic:blipFill>
+                  <pic:spPr bwMode="auto">
+                    <a:xfrm>
+                      <a:off x="0" y="0"/>
+                      <a:ext cx="4267200" cy="2455622"/>
+                    </a:xfrm>
+                    <a:prstGeom prst="rect">
+                      <a:avLst/>
+                    </a:prstGeom>
+                    <a:noFill/>
+                    <a:ln w="9525">
+                      <a:noFill/>
+                      <a:headEnd/>
+                      <a:tailEnd/>
+                    </a:ln>
+                  </pic:spPr>
+                </pic:pic>
+              </a:graphicData>
+            </a:graphic>
+          </wp:inline>
+        </w:drawing>
+      </w:r>
+    </w:p>
+    <w:p>
+      <w:pPr>
+        <w:pStyle w:val="BodyText"/>
+      </w:pPr>
+      <w:r>
+        <w:rPr>
+          <w:b/>
+          <w:bCs/>
+        </w:rPr>
+        <w:t xml:space="preserve">Figure 7.</w:t>
+      </w:r>
+      <w:r>
+        <w:t xml:space="preserve"> </w:t>
+      </w:r>
+      <w:r>
+        <w:t xml:space="preserve">Retrieval comparison on the default (hashing) embedder. Keyword-only has the highest nDCG@5; the three strategies are close because the hashing vector signal is itself largely lexical.</w:t>
+      </w:r>
+    </w:p>
+    <w:p>
+      <w:pPr>
+        <w:pStyle w:val="BodyText"/>
+      </w:pPr>
+      <w:r>
         <w:t xml:space="preserve">The number that first looks like the headline, hybrid’s combined score of 0.9126, needs the honest reading I gave in Chapter 5. Keyword only has the best pure ranking here; its nDCG of 0.9441 is the highest in the table. Hybrid leads the combined score only because that score folds in abstention accuracy, where the evidence gate refused four of five unsupported questions. Since the vector signal on this embedder is lexical, the two fused signals are correlated, so this is not a clean demonstration that dense retrieval helps. It is a demonstration that a refusal policy attached to a lexical ranker does well on a lexical corpus. That is a narrower and more accurate claim.</w:t>
       </w:r>
     </w:p>
@@ -4642,8 +4959,8 @@
         <w:t xml:space="preserve">The perfect citation-or-refusal coverage of 1.0000 also deserves its caveat. The offline answerer tags every sentence it emits with a source number, so in offline mode a citation is almost always present by construction. The metric confirms the plumbing, not the faithfulness of the citation to the claim.</w:t>
       </w:r>
     </w:p>
-    <w:bookmarkEnd w:id="70"/>
-    <w:bookmarkStart w:id="71" w:name="results-with-a-learned-embedder"/>
+    <w:bookmarkEnd w:id="85"/>
+    <w:bookmarkStart w:id="92" w:name="results-with-a-learned-embedder"/>
     <w:p>
       <w:pPr>
         <w:pStyle w:val="Heading2"/>
@@ -5010,8 +5327,138 @@
         <w:t xml:space="preserve">The third finding is the one I keep coming back to. The evidence gate collapsed. Its accuracy on the unanswerable questions fell to zero for every retrieval mode. The gate’s thresholds had been tuned to the hashing embedder’s score scale, and the learned model produces cosine similarities on a different, generally higher scale, so the thresholds that used to catch weak evidence never fired. The gate is not broken in principle; it is uncalibrated for the new embedder. The lesson is that refusal thresholds are specific to the scoring underneath them and must be recalibrated whenever that scoring changes. A threshold tuned on one embedder tells you nothing about another, and the zero in that table is uncalibrated gating rather than a retrieval failure.</w:t>
       </w:r>
     </w:p>
-    <w:bookmarkEnd w:id="71"/>
-    <w:bookmarkStart w:id="72" w:name="what-the-numbers-add-up-to"/>
+    <w:p>
+      <w:pPr>
+        <w:pStyle w:val="BodyText"/>
+      </w:pPr>
+      <w:r>
+        <w:drawing>
+          <wp:inline>
+            <wp:extent cx="4267200" cy="2600224"/>
+            <wp:effectExtent b="0" l="0" r="0" t="0"/>
+            <wp:docPr descr="" title="" id="87" name="Picture"/>
+            <a:graphic>
+              <a:graphicData uri="http://schemas.openxmlformats.org/drawingml/2006/picture">
+                <pic:pic>
+                  <pic:nvPicPr>
+                    <pic:cNvPr descr="figures/fig8_embedder_ablation.png" id="88" name="Picture"/>
+                    <pic:cNvPicPr>
+                      <a:picLocks noChangeArrowheads="1" noChangeAspect="1"/>
+                    </pic:cNvPicPr>
+                  </pic:nvPicPr>
+                  <pic:blipFill>
+                    <a:blip r:embed="rId86"/>
+                    <a:stretch>
+                      <a:fillRect/>
+                    </a:stretch>
+                  </pic:blipFill>
+                  <pic:spPr bwMode="auto">
+                    <a:xfrm>
+                      <a:off x="0" y="0"/>
+                      <a:ext cx="4267200" cy="2600224"/>
+                    </a:xfrm>
+                    <a:prstGeom prst="rect">
+                      <a:avLst/>
+                    </a:prstGeom>
+                    <a:noFill/>
+                    <a:ln w="9525">
+                      <a:noFill/>
+                      <a:headEnd/>
+                      <a:tailEnd/>
+                    </a:ln>
+                  </pic:spPr>
+                </pic:pic>
+              </a:graphicData>
+            </a:graphic>
+          </wp:inline>
+        </w:drawing>
+      </w:r>
+    </w:p>
+    <w:p>
+      <w:pPr>
+        <w:pStyle w:val="BodyText"/>
+      </w:pPr>
+      <w:r>
+        <w:rPr>
+          <w:b/>
+          <w:bCs/>
+        </w:rPr>
+        <w:t xml:space="preserve">Figure 8.</w:t>
+      </w:r>
+      <w:r>
+        <w:t xml:space="preserve"> </w:t>
+      </w:r>
+      <w:r>
+        <w:t xml:space="preserve">Swapping in a learned embedder. The ranking metrics improve, but the hybrid abstention accuracy falls from 0.80 to 0.00 because the gate thresholds were tuned to the hashing embedder’s score scale.</w:t>
+      </w:r>
+    </w:p>
+    <w:p>
+      <w:pPr>
+        <w:pStyle w:val="BodyText"/>
+      </w:pPr>
+      <w:r>
+        <w:drawing>
+          <wp:inline>
+            <wp:extent cx="3840480" cy="2649963"/>
+            <wp:effectExtent b="0" l="0" r="0" t="0"/>
+            <wp:docPr descr="" title="" id="90" name="Picture"/>
+            <a:graphic>
+              <a:graphicData uri="http://schemas.openxmlformats.org/drawingml/2006/picture">
+                <pic:pic>
+                  <pic:nvPicPr>
+                    <pic:cNvPr descr="figures/fig9_answer_metrics.png" id="91" name="Picture"/>
+                    <pic:cNvPicPr>
+                      <a:picLocks noChangeArrowheads="1" noChangeAspect="1"/>
+                    </pic:cNvPicPr>
+                  </pic:nvPicPr>
+                  <pic:blipFill>
+                    <a:blip r:embed="rId89"/>
+                    <a:stretch>
+                      <a:fillRect/>
+                    </a:stretch>
+                  </pic:blipFill>
+                  <pic:spPr bwMode="auto">
+                    <a:xfrm>
+                      <a:off x="0" y="0"/>
+                      <a:ext cx="3840480" cy="2649963"/>
+                    </a:xfrm>
+                    <a:prstGeom prst="rect">
+                      <a:avLst/>
+                    </a:prstGeom>
+                    <a:noFill/>
+                    <a:ln w="9525">
+                      <a:noFill/>
+                      <a:headEnd/>
+                      <a:tailEnd/>
+                    </a:ln>
+                  </pic:spPr>
+                </pic:pic>
+              </a:graphicData>
+            </a:graphic>
+          </wp:inline>
+        </w:drawing>
+      </w:r>
+    </w:p>
+    <w:p>
+      <w:pPr>
+        <w:pStyle w:val="BodyText"/>
+      </w:pPr>
+      <w:r>
+        <w:rPr>
+          <w:b/>
+          <w:bCs/>
+        </w:rPr>
+        <w:t xml:space="preserve">Figure 9.</w:t>
+      </w:r>
+      <w:r>
+        <w:t xml:space="preserve"> </w:t>
+      </w:r>
+      <w:r>
+        <w:t xml:space="preserve">Answer-evaluation metrics by embedder. The learned embedder gives a slightly lower fact recall on this vocabulary-aligned corpus, and its uncalibrated gate refuses none of the unanswerable questions.</w:t>
+      </w:r>
+    </w:p>
+    <w:bookmarkEnd w:id="92"/>
+    <w:bookmarkStart w:id="93" w:name="what-the-numbers-add-up-to"/>
     <w:p>
       <w:pPr>
         <w:pStyle w:val="Heading2"/>
@@ -5036,9 +5483,9 @@
         <w:t xml:space="preserve">More broadly, the value of the evaluation was not any single number. It was that each stage could be measured on its own, so that when the learned embedder made ranking better and answers slightly worse and refusal completely broken, I could see all three at once and understand why, instead of watching one aggregate score move and guessing. That is the property I set out to build in week one, and it is the one I am most satisfied with.</w:t>
       </w:r>
     </w:p>
-    <w:bookmarkEnd w:id="72"/>
-    <w:bookmarkEnd w:id="73"/>
-    <w:bookmarkStart w:id="80" w:name="Xbef0e534786d6e66942725944e54918579fcf5c"/>
+    <w:bookmarkEnd w:id="93"/>
+    <w:bookmarkEnd w:id="94"/>
+    <w:bookmarkStart w:id="101" w:name="Xbef0e534786d6e66942725944e54918579fcf5c"/>
     <w:p>
       <w:pPr>
         <w:pStyle w:val="Heading1"/>
@@ -5055,7 +5502,7 @@
         <w:t xml:space="preserve">Rather than a generic list of difficulties, this chapter collects the specific problems that cost me real time, because those are the ones with lessons attached. Several were mentioned in passing in Chapter 5; here I say what actually went wrong and what I changed in how I work.</w:t>
       </w:r>
     </w:p>
-    <w:bookmarkStart w:id="74" w:name="the-vector-search-that-was-not-semantic"/>
+    <w:bookmarkStart w:id="95" w:name="the-vector-search-that-was-not-semantic"/>
     <w:p>
       <w:pPr>
         <w:pStyle w:val="Heading2"/>
@@ -5072,8 +5519,8 @@
         <w:t xml:space="preserve">The two days in week three when I thought I had semantic search and did not were the most useful failure of the internship. I had built a hashing embedder, seen it return sensible results on the sample questions, and concluded it was matching on meaning. It was matching on shared words. The problem was not the hashing embedder, which is a perfectly good default for what it is. The problem was that I had believed a component did something without ever testing the specific claim. Cosine similarity over a lexical embedding is still cosine similarity, and it produces plausible results, which is exactly what makes the mistaken belief so easy to hold onto. Now, when I catch myself saying a component does X, I try to think of a test that would fail if it only did some cheaper thing that looks like X from the outside.</w:t>
       </w:r>
     </w:p>
-    <w:bookmarkEnd w:id="74"/>
-    <w:bookmarkStart w:id="75" w:name="the-fabricated-citation"/>
+    <w:bookmarkEnd w:id="95"/>
+    <w:bookmarkStart w:id="96" w:name="the-fabricated-citation"/>
     <w:p>
       <w:pPr>
         <w:pStyle w:val="Heading2"/>
@@ -5090,8 +5537,8 @@
         <w:t xml:space="preserve">The citation my code appended when the model produced none is the mistake I am least proud of and learned the most operationally from. It was not malicious; I added it so the interface would always have a citation to show, and I did not think through what it did to the metric. The result was a citation-coverage number of a perfect 1.0 that measured my own code rather than the model’s behaviour. It survived my own tests because my tests checked that a citation was present, which it always was, precisely because I was forcing it. It took a second reader to see that the test and the bug had been shaped to fit each other. A metric you can make perfect by editing your own output is not measuring the system; it is measuring how willing you are to edit the output. I have been suspicious of any number that comes out perfect ever since.</w:t>
       </w:r>
     </w:p>
-    <w:bookmarkEnd w:id="75"/>
-    <w:bookmarkStart w:id="76" w:name="thresholds-tuned-on-the-test-set"/>
+    <w:bookmarkEnd w:id="96"/>
+    <w:bookmarkStart w:id="97" w:name="thresholds-tuned-on-the-test-set"/>
     <w:p>
       <w:pPr>
         <w:pStyle w:val="Heading2"/>
@@ -5108,8 +5555,8 @@
         <w:t xml:space="preserve">I knew, while I was doing it in week four, that tuning the evidence-gate thresholds on the same questions I evaluated on was a form of leakage. I did it anyway because I had no separate tuning set and the deadline was real, and I wrote a note that the thresholds were not real constants. Week seven proved the note right in the most direct way possible: change the embedder and the thresholds become worthless. The proper fix, which I did not have time to do, is a separate validation split used only for tuning. Tuning on your test set does not announce itself as a failure at the time it happens. It announces itself later, when something you did not expect to matter changes and the fitted values fall over, which is exactly how it played out.</w:t>
       </w:r>
     </w:p>
-    <w:bookmarkEnd w:id="76"/>
-    <w:bookmarkStart w:id="77" w:name="the-python-version-constraint"/>
+    <w:bookmarkEnd w:id="97"/>
+    <w:bookmarkStart w:id="98" w:name="the-python-version-constraint"/>
     <w:p>
       <w:pPr>
         <w:pStyle w:val="Heading2"/>
@@ -5126,8 +5573,8 @@
         <w:t xml:space="preserve">A smaller, more ordinary problem. The environment had Python 3.9, and at one point I wrote a type hint using a syntax that only exists in newer versions, and the import failed with an error that did not obviously point at the cause. It took me longer than it should have to connect the error to the version, because I assumed the problem was in my logic rather than in the syntax. A mundane thing to relearn: when an error makes no sense, check the boring possibilities first, and the version of the language you are running is one of the boring possibilities.</w:t>
       </w:r>
     </w:p>
-    <w:bookmarkEnd w:id="77"/>
-    <w:bookmarkStart w:id="78" w:name="stale-documentation"/>
+    <w:bookmarkEnd w:id="98"/>
+    <w:bookmarkStart w:id="99" w:name="stale-documentation"/>
     <w:p>
       <w:pPr>
         <w:pStyle w:val="Heading2"/>
@@ -5144,8 +5591,8 @@
         <w:t xml:space="preserve">By the end I had documentation that confidently described behaviour the code no longer had: the fabricated citation, the made-up model name, the claim that the embedder was not yet configurable when by then it was. Documentation drifts out of sync with code silently, and a reader trusts the documentation anyway. Fixing this in week seven took real time. Since then I have tried to treat the description of a behaviour as part of the same change as the behaviour itself, rather than a thing to catch up on later.</w:t>
       </w:r>
     </w:p>
-    <w:bookmarkEnd w:id="78"/>
-    <w:bookmarkStart w:id="79" w:name="the-general-shape-of-these-lessons"/>
+    <w:bookmarkEnd w:id="99"/>
+    <w:bookmarkStart w:id="100" w:name="the-general-shape-of-these-lessons"/>
     <w:p>
       <w:pPr>
         <w:pStyle w:val="Heading2"/>
@@ -5162,9 +5609,9 @@
         <w:t xml:space="preserve">Looking at these together, most of them are versions of the same thing: I believed something about the system that I had not actually verified, and the belief was comfortable because the system’s behaviour was consistent with it right up until it was not. Semantic search that was lexical, a citation metric that was self-fulfilling, thresholds that were fitted to one setup, documentation that described an older version. The habit I am trying to build out of this internship is to ask, of each claim I make about the system, what test would catch me if I were wrong, and then to run it.</w:t>
       </w:r>
     </w:p>
-    <w:bookmarkEnd w:id="79"/>
-    <w:bookmarkEnd w:id="80"/>
-    <w:bookmarkStart w:id="85" w:name="chapter-9.-security-privacy-and-ethics"/>
+    <w:bookmarkEnd w:id="100"/>
+    <w:bookmarkEnd w:id="101"/>
+    <w:bookmarkStart w:id="106" w:name="chapter-9.-security-privacy-and-ethics"/>
     <w:p>
       <w:pPr>
         <w:pStyle w:val="Heading1"/>
@@ -5181,7 +5628,7 @@
         <w:t xml:space="preserve">The system is a local, single-user tool, and I built it as one. This chapter is plain about what that means, because the failure mode of a project like this is to describe it as if it were ready for a setting it was never designed for.</w:t>
       </w:r>
     </w:p>
-    <w:bookmarkStart w:id="81" w:name="what-the-system-does-not-protect-against"/>
+    <w:bookmarkStart w:id="102" w:name="what-the-system-does-not-protect-against"/>
     <w:p>
       <w:pPr>
         <w:pStyle w:val="Heading2"/>
@@ -5206,8 +5653,8 @@
         <w:t xml:space="preserve">The cross-origin policy is now an explicit list of allowed origins rather than a wildcard, and uploads are size-limited, but these are hardening measures on a tool that is still meant for local use, not a claim that it is safe to deploy.</w:t>
       </w:r>
     </w:p>
-    <w:bookmarkEnd w:id="81"/>
-    <w:bookmarkStart w:id="82" w:name="sending-documents-to-an-external-service"/>
+    <w:bookmarkEnd w:id="102"/>
+    <w:bookmarkStart w:id="103" w:name="sending-documents-to-an-external-service"/>
     <w:p>
       <w:pPr>
         <w:pStyle w:val="Heading2"/>
@@ -5224,8 +5671,8 @@
         <w:t xml:space="preserve">The moment the OpenAI provider is enabled, documents and questions leave the machine and go to a third party. That is a decision with real consequences, and it is not mine to make for a user. Before turning it on, someone has to decide whether the data is allowed to leave: its classification, the provider’s retention terms, where it is processed, and whether the people whose data it is have consented. The offline default exists partly so that this decision is opt-in rather than the path of least resistance. The API key lives only in an environment variable and never in the code, the frontend, a prompt, or a committed file.</w:t>
       </w:r>
     </w:p>
-    <w:bookmarkEnd w:id="82"/>
-    <w:bookmarkStart w:id="83" w:name="prompt-injection"/>
+    <w:bookmarkEnd w:id="103"/>
+    <w:bookmarkStart w:id="104" w:name="prompt-injection"/>
     <w:p>
       <w:pPr>
         <w:pStyle w:val="Heading2"/>
@@ -5242,8 +5689,8 @@
         <w:t xml:space="preserve">Prompt injection is the risk that untrusted text inside a document tries to hijack the model. A document could contain a line telling the model to ignore its instructions and reveal something, and because RAG pastes document text straight into the prompt, that line arrives in the model’s context. The system separates the instructions from the retrieved context, which helps a little, but it does not detect or neutralise malicious content, and I did not build defences against this. For a corpus of trusted internal documents the risk is low; for a corpus that includes anything a stranger could write, it is real, and content filtering and injection test cases would be needed.</w:t>
       </w:r>
     </w:p>
-    <w:bookmarkEnd w:id="83"/>
-    <w:bookmarkStart w:id="84" w:name="the-ethics-of-a-confident-assistant"/>
+    <w:bookmarkEnd w:id="104"/>
+    <w:bookmarkStart w:id="105" w:name="the-ethics-of-a-confident-assistant"/>
     <w:p>
       <w:pPr>
         <w:pStyle w:val="Heading2"/>
@@ -5260,9 +5707,9 @@
         <w:t xml:space="preserve">The deeper ethical issue is subtler than security. An assistant that answers fluently and shows sources looks authoritative, and users tend to trust things that look authoritative. Citations and refusals help, because they let a user check and they admit ignorance when ignorance is the honest state. But they do not remove bias in the documents, they do not catch a citation that points at a passage which does not actually support the claim, and they do not stop a user from taking the answer as settled. The right framing for a tool like this is decision support, not an authority. A serious deployment would need a way for users to flag wrong answers, a way to correct or remove documents, and human review for anything consequential. Building the transparency features was the easy part; using them responsibly is a human problem the software cannot solve on its own.</w:t>
       </w:r>
     </w:p>
-    <w:bookmarkEnd w:id="84"/>
-    <w:bookmarkEnd w:id="85"/>
-    <w:bookmarkStart w:id="88" w:name="chapter-10.-limitations-and-future-work"/>
+    <w:bookmarkEnd w:id="105"/>
+    <w:bookmarkEnd w:id="106"/>
+    <w:bookmarkStart w:id="109" w:name="chapter-10.-limitations-and-future-work"/>
     <w:p>
       <w:pPr>
         <w:pStyle w:val="Heading1"/>
@@ -5271,7 +5718,7 @@
         <w:t xml:space="preserve">Chapter 10. Limitations and future work</w:t>
       </w:r>
     </w:p>
-    <w:bookmarkStart w:id="86" w:name="limitations"/>
+    <w:bookmarkStart w:id="107" w:name="limitations"/>
     <w:p>
       <w:pPr>
         <w:pStyle w:val="Heading2"/>
@@ -5288,8 +5735,8 @@
         <w:t xml:space="preserve">The honest limitations of the system, collected in one place. The corpus is small, synthetic, and hand-written, so the numbers guide engineering decisions but do not predict real-world performance. The default embedder is lexical rather than semantic. Every query scans all passages in memory, which does not scale. Citations are checked for validity but not for whether they support the claim. The fact-recall metric is a word-overlap proxy that cannot judge meaning. The evidence-gate thresholds are tuned to one embedder and do not transfer. There is no reranking, no query rewriting, no conversation memory, no OCR for scanned documents, and no structured extraction of tables. Production concerns like authentication, access control, and audit logging are absent by design. The remote providers have not been measured for real cost, latency, or failure behaviour, because the recorded runs were all offline.</w:t>
       </w:r>
     </w:p>
-    <w:bookmarkEnd w:id="86"/>
-    <w:bookmarkStart w:id="87" w:name="what-i-would-do-next"/>
+    <w:bookmarkEnd w:id="107"/>
+    <w:bookmarkStart w:id="108" w:name="what-i-would-do-next"/>
     <w:p>
       <w:pPr>
         <w:pStyle w:val="Heading2"/>
@@ -5362,9 +5809,9 @@
         <w:t xml:space="preserve">I list these in this order because it is the order of what would most improve trust in the results, not the order of what would be most fun to build. The reranker and the learned retrieval are the interesting engineering; the data split and the honest recalibration are what would actually make the numbers mean something.</w:t>
       </w:r>
     </w:p>
-    <w:bookmarkEnd w:id="87"/>
-    <w:bookmarkEnd w:id="88"/>
-    <w:bookmarkStart w:id="89" w:name="chapter-11.-conclusion"/>
+    <w:bookmarkEnd w:id="108"/>
+    <w:bookmarkEnd w:id="109"/>
+    <w:bookmarkStart w:id="110" w:name="chapter-11.-conclusion"/>
     <w:p>
       <w:pPr>
         <w:pStyle w:val="Heading1"/>
@@ -5405,8 +5852,8 @@
         <w:t xml:space="preserve">The system is a prototype, and Chapter 10 is honest about how far it is from a real deployment. But it does the thing it was meant to do, its results are real and reproducible, and I can explain every part of it, including the parts that do not work. For a first serious project, being able to say that feels like the right outcome.</w:t>
       </w:r>
     </w:p>
-    <w:bookmarkEnd w:id="89"/>
-    <w:bookmarkStart w:id="90" w:name="references"/>
+    <w:bookmarkEnd w:id="110"/>
+    <w:bookmarkStart w:id="111" w:name="references"/>
     <w:p>
       <w:pPr>
         <w:pStyle w:val="Heading1"/>
@@ -5519,8 +5966,8 @@
         <w:t xml:space="preserve">Software and documentation I relied on: the FastAPI documentation, the SQLite documentation, the sentence-transformers library by Reimers and Gurevych, the pypdf library, the OpenAI Python SDK and Responses API documentation, and the Ollama project documentation. This report was written in Markdown and rendered with Pandoc.</w:t>
       </w:r>
     </w:p>
-    <w:bookmarkEnd w:id="90"/>
-    <w:bookmarkStart w:id="91" w:name="appendix-a.-configuration-reference"/>
+    <w:bookmarkEnd w:id="111"/>
+    <w:bookmarkStart w:id="112" w:name="appendix-a.-configuration-reference"/>
     <w:p>
       <w:pPr>
         <w:pStyle w:val="Heading1"/>
@@ -6183,8 +6630,8 @@
         </w:tc>
       </w:tr>
     </w:tbl>
-    <w:bookmarkEnd w:id="91"/>
-    <w:bookmarkStart w:id="92" w:name="appendix-b.-command-reference"/>
+    <w:bookmarkEnd w:id="112"/>
+    <w:bookmarkStart w:id="113" w:name="appendix-b.-command-reference"/>
     <w:p>
       <w:pPr>
         <w:pStyle w:val="Heading1"/>
@@ -6384,8 +6831,8 @@
         <w:t xml:space="preserve">To reproduce the learned-embedding results in Chapter 7, install the sentence-transformers package, run the comparison and the evaluation with the embedding provider set to sentence-transformers, and compare the output against the default runs.</w:t>
       </w:r>
     </w:p>
-    <w:bookmarkEnd w:id="92"/>
-    <w:bookmarkStart w:id="93" w:name="appendix-c.-weekly-logbook-summary"/>
+    <w:bookmarkEnd w:id="113"/>
+    <w:bookmarkStart w:id="114" w:name="appendix-c.-weekly-logbook-summary"/>
     <w:p>
       <w:pPr>
         <w:pStyle w:val="Heading1"/>
@@ -6779,8 +7226,8 @@
         </w:tc>
       </w:tr>
     </w:tbl>
-    <w:bookmarkEnd w:id="93"/>
-    <w:bookmarkStart w:id="94" w:name="appendix-d.-glossary"/>
+    <w:bookmarkEnd w:id="114"/>
+    <w:bookmarkStart w:id="115" w:name="appendix-d.-glossary"/>
     <w:p>
       <w:pPr>
         <w:pStyle w:val="Heading1"/>
@@ -6957,8 +7404,8 @@
         <w:t xml:space="preserve">Top-k: the number of top-ranked passages kept, here five.</w:t>
       </w:r>
     </w:p>
-    <w:bookmarkEnd w:id="94"/>
-    <w:bookmarkStart w:id="98" w:name="appendix-e.-requirements-and-use-cases"/>
+    <w:bookmarkEnd w:id="115"/>
+    <w:bookmarkStart w:id="119" w:name="appendix-e.-requirements-and-use-cases"/>
     <w:p>
       <w:pPr>
         <w:pStyle w:val="Heading1"/>
@@ -6975,7 +7422,7 @@
         <w:t xml:space="preserve">I wrote a short requirements list at the start and refined it through the internship. It is not a formal specification, but it captured what the system had to do and what it had to be, and it is worth recording.</w:t>
       </w:r>
     </w:p>
-    <w:bookmarkStart w:id="95" w:name="e.1-functional-requirements"/>
+    <w:bookmarkStart w:id="116" w:name="e.1-functional-requirements"/>
     <w:p>
       <w:pPr>
         <w:pStyle w:val="Heading2"/>
@@ -7239,8 +7686,8 @@
         </w:tc>
       </w:tr>
     </w:tbl>
-    <w:bookmarkEnd w:id="95"/>
-    <w:bookmarkStart w:id="96" w:name="e.2-non-functional-requirements"/>
+    <w:bookmarkEnd w:id="116"/>
+    <w:bookmarkStart w:id="117" w:name="e.2-non-functional-requirements"/>
     <w:p>
       <w:pPr>
         <w:pStyle w:val="Heading2"/>
@@ -7432,8 +7879,8 @@
         </w:tc>
       </w:tr>
     </w:tbl>
-    <w:bookmarkEnd w:id="96"/>
-    <w:bookmarkStart w:id="97" w:name="e.3-selected-use-cases"/>
+    <w:bookmarkEnd w:id="117"/>
+    <w:bookmarkStart w:id="118" w:name="e.3-selected-use-cases"/>
     <w:p>
       <w:pPr>
         <w:pStyle w:val="Heading2"/>
@@ -7490,9 +7937,9 @@
         <w:t xml:space="preserve">Use case: switch to a stronger generator. An operator sets the provider to OpenAI or Ollama and supplies the necessary configuration. The orchestration is unchanged; only the answer text now comes from the chosen model. The operator is responsible for the data-handling decision this implies.</w:t>
       </w:r>
     </w:p>
-    <w:bookmarkEnd w:id="97"/>
-    <w:bookmarkEnd w:id="98"/>
-    <w:bookmarkStart w:id="105" w:name="appendix-f.-the-test-set"/>
+    <w:bookmarkEnd w:id="118"/>
+    <w:bookmarkEnd w:id="119"/>
+    <w:bookmarkStart w:id="126" w:name="appendix-f.-the-test-set"/>
     <w:p>
       <w:pPr>
         <w:pStyle w:val="Heading1"/>
@@ -7509,7 +7956,7 @@
         <w:t xml:space="preserve">The evaluation rests on 41 questions over 13 documents, so the design of that set matters as much as the code. This appendix records how it was built and gives representative questions from each category. The full set is versioned in the repository as JSON Lines.</w:t>
       </w:r>
     </w:p>
-    <w:bookmarkStart w:id="99" w:name="f.1-categories"/>
+    <w:bookmarkStart w:id="120" w:name="f.1-categories"/>
     <w:p>
       <w:pPr>
         <w:pStyle w:val="Heading2"/>
@@ -7526,8 +7973,8 @@
         <w:t xml:space="preserve">The 41 questions break down into 30 answerable, 3 ambiguous, 3 conflicting, and 5 unanswerable. Each question carries an identifier, the question text, the expected source documents, the specific facts an answer should contain, a category, and a difficulty label. The categories were chosen so that the set exercises not just lookup but judgement: knowing when the documents disagree, when a question is unclear, and when there is simply no answer.</w:t>
       </w:r>
     </w:p>
-    <w:bookmarkEnd w:id="99"/>
-    <w:bookmarkStart w:id="100" w:name="f.2-answerable-questions"/>
+    <w:bookmarkEnd w:id="120"/>
+    <w:bookmarkStart w:id="121" w:name="f.2-answerable-questions"/>
     <w:p>
       <w:pPr>
         <w:pStyle w:val="Heading2"/>
@@ -7544,8 +7991,8 @@
         <w:t xml:space="preserve">These are ordinary lookups where a single passage or a small number of passages contain the answer. Examples in the spirit of the set: what evidence is required for a travel reimbursement claim; what the working hours are during the internship; what the policy is on publishing internship work as open source; what the process is for requesting laboratory access. Each of these has a clear source document and a small set of required facts, and a correct answer should quote or paraphrase those facts and cite the source.</w:t>
       </w:r>
     </w:p>
-    <w:bookmarkEnd w:id="100"/>
-    <w:bookmarkStart w:id="101" w:name="f.3-ambiguous-questions"/>
+    <w:bookmarkEnd w:id="121"/>
+    <w:bookmarkStart w:id="122" w:name="f.3-ambiguous-questions"/>
     <w:p>
       <w:pPr>
         <w:pStyle w:val="Heading2"/>
@@ -7574,8 +8021,8 @@
         <w:t xml:space="preserve">that could mean sick leave, casual leave, or leaving the programme early. A good outcome here is retrieving the passages for the most likely readings and answering from them with citations, so the user can see which sense was used.</w:t>
       </w:r>
     </w:p>
-    <w:bookmarkEnd w:id="101"/>
-    <w:bookmarkStart w:id="102" w:name="f.4-conflicting-questions"/>
+    <w:bookmarkEnd w:id="122"/>
+    <w:bookmarkStart w:id="123" w:name="f.4-conflicting-questions"/>
     <w:p>
       <w:pPr>
         <w:pStyle w:val="Heading2"/>
@@ -7592,8 +8039,8 @@
         <w:t xml:space="preserve">These are the ones where the current policy and the archived 2025 FAQ give different answers, usually because a figure or a rule changed. The system must prefer the current source. An example in spirit: a stipend figure that was revised between the archived FAQ and the current policy. The correct behaviour is to retrieve both, rank the current policy higher, and answer with the current figure, ideally without being derailed by the older one.</w:t>
       </w:r>
     </w:p>
-    <w:bookmarkEnd w:id="102"/>
-    <w:bookmarkStart w:id="103" w:name="f.5-unanswerable-questions"/>
+    <w:bookmarkEnd w:id="123"/>
+    <w:bookmarkStart w:id="124" w:name="f.5-unanswerable-questions"/>
     <w:p>
       <w:pPr>
         <w:pStyle w:val="Heading2"/>
@@ -7610,8 +8057,8 @@
         <w:t xml:space="preserve">These have no answer in the documents at all, and the correct behaviour is refusal. Examples in spirit: a question about a benefit the programme does not offer, or about a policy area the documents never cover. The measure here is whether the evidence gate correctly declines. On the default embedder the system refused four of these five; the one it did not refuse retrieved a passage that shared enough vocabulary with the question to slip past the gate, which is exactly the kind of borderline case that makes a single threshold hard to set.</w:t>
       </w:r>
     </w:p>
-    <w:bookmarkEnd w:id="103"/>
-    <w:bookmarkStart w:id="104" w:name="f.6-why-the-hard-cases-matter"/>
+    <w:bookmarkEnd w:id="124"/>
+    <w:bookmarkStart w:id="125" w:name="f.6-why-the-hard-cases-matter"/>
     <w:p>
       <w:pPr>
         <w:pStyle w:val="Heading2"/>
@@ -7628,9 +8075,9 @@
         <w:t xml:space="preserve">A system shown only answerable questions will look excellent and fail the first time a real user asks something out of scope. The unanswerable and conflicting questions are a small fraction of the set by count but a large fraction of its value, because they are where the difference between a careful system and a confident one shows up. Building them deliberately, rather than hoping they turned up by accident, was one of the better decisions in week five.</w:t>
       </w:r>
     </w:p>
-    <w:bookmarkEnd w:id="104"/>
-    <w:bookmarkEnd w:id="105"/>
-    <w:bookmarkStart w:id="111" w:name="appendix-g.-selected-code-listings"/>
+    <w:bookmarkEnd w:id="125"/>
+    <w:bookmarkEnd w:id="126"/>
+    <w:bookmarkStart w:id="132" w:name="appendix-g.-selected-code-listings"/>
     <w:p>
       <w:pPr>
         <w:pStyle w:val="Heading1"/>
@@ -7647,7 +8094,7 @@
         <w:t xml:space="preserve">These are the pieces of the implementation most worth reading, taken from the repository. They are lightly trimmed for length but otherwise as they run.</w:t>
       </w:r>
     </w:p>
-    <w:bookmarkStart w:id="106" w:name="g.1-the-hashing-embedder"/>
+    <w:bookmarkStart w:id="127" w:name="g.1-the-hashing-embedder"/>
     <w:p>
       <w:pPr>
         <w:pStyle w:val="Heading2"/>
@@ -8348,8 +8795,8 @@
         <w:t xml:space="preserve"> normalize(vector)</w:t>
       </w:r>
     </w:p>
-    <w:bookmarkEnd w:id="106"/>
-    <w:bookmarkStart w:id="107" w:name="g.2-hybrid-retrieval-and-fusion"/>
+    <w:bookmarkEnd w:id="127"/>
+    <w:bookmarkStart w:id="128" w:name="g.2-hybrid-retrieval-and-fusion"/>
     <w:p>
       <w:pPr>
         <w:pStyle w:val="Heading2"/>
@@ -8897,8 +9344,8 @@
         <w:t xml:space="preserve">)</w:t>
       </w:r>
     </w:p>
-    <w:bookmarkEnd w:id="107"/>
-    <w:bookmarkStart w:id="108" w:name="g.3-the-evidence-gate"/>
+    <w:bookmarkEnd w:id="128"/>
+    <w:bookmarkStart w:id="129" w:name="g.3-the-evidence-gate"/>
     <w:p>
       <w:pPr>
         <w:pStyle w:val="Heading2"/>
@@ -9259,8 +9706,8 @@
         <w:t xml:space="preserve">are the reason a genuine answer is rarely refused: it almost always scores well on at least one of them. They are also the four numbers that did not survive a change of embedder, as Chapter 7 describes.</w:t>
       </w:r>
     </w:p>
-    <w:bookmarkEnd w:id="108"/>
-    <w:bookmarkStart w:id="109" w:name="X5d929f64cd78123e1b1a07d79e4469de1956f90"/>
+    <w:bookmarkEnd w:id="129"/>
+    <w:bookmarkStart w:id="130" w:name="X5d929f64cd78123e1b1a07d79e4469de1956f90"/>
     <w:p>
       <w:pPr>
         <w:pStyle w:val="Heading2"/>
@@ -9753,8 +10200,8 @@
         <w:t xml:space="preserve">This is the corrected version from week six. There is no line that appends a citation when the model produced none; an uncited answer is recorded as a diagnostic instead.</w:t>
       </w:r>
     </w:p>
-    <w:bookmarkEnd w:id="109"/>
-    <w:bookmarkStart w:id="110" w:name="g.5-the-fact-coverage-check"/>
+    <w:bookmarkEnd w:id="130"/>
+    <w:bookmarkStart w:id="131" w:name="g.5-the-fact-coverage-check"/>
     <w:p>
       <w:pPr>
         <w:pStyle w:val="Heading2"/>
@@ -10130,9 +10577,9 @@
         <w:t xml:space="preserve">This is the lenient proxy from Chapter 7. It is honest about being a proxy: it counts a fact as present when at least half of its longer words appear in the answer, which is cheap and blind to meaning.</w:t>
       </w:r>
     </w:p>
-    <w:bookmarkEnd w:id="110"/>
-    <w:bookmarkEnd w:id="111"/>
-    <w:bookmarkStart w:id="115" w:name="appendix-h.-figures"/>
+    <w:bookmarkEnd w:id="131"/>
+    <w:bookmarkEnd w:id="132"/>
+    <w:bookmarkStart w:id="139" w:name="appendix-h.-figures"/>
     <w:p>
       <w:pPr>
         <w:pStyle w:val="Heading1"/>
@@ -10146,99 +10593,182 @@
         <w:pStyle w:val="FirstParagraph"/>
       </w:pPr>
       <w:r>
-        <w:t xml:space="preserve">The architecture and the two main flows are simple enough to draw in text.</w:t>
-      </w:r>
-    </w:p>
-    <w:bookmarkStart w:id="112" w:name="h.1-the-pipeline"/>
+        <w:t xml:space="preserve">The two main flows through the system are shown below. The overall architecture appears earlier as Figure 3.</w:t>
+      </w:r>
+    </w:p>
+    <w:p>
+      <w:pPr>
+        <w:pStyle w:val="BodyText"/>
+      </w:pPr>
+      <w:r>
+        <w:drawing>
+          <wp:inline>
+            <wp:extent cx="5227320" cy="1099937"/>
+            <wp:effectExtent b="0" l="0" r="0" t="0"/>
+            <wp:docPr descr="" title="" id="134" name="Picture"/>
+            <a:graphic>
+              <a:graphicData uri="http://schemas.openxmlformats.org/drawingml/2006/picture">
+                <pic:pic>
+                  <pic:nvPicPr>
+                    <pic:cNvPr descr="figures/fig5_ingestion.png" id="135" name="Picture"/>
+                    <pic:cNvPicPr>
+                      <a:picLocks noChangeArrowheads="1" noChangeAspect="1"/>
+                    </pic:cNvPicPr>
+                  </pic:nvPicPr>
+                  <pic:blipFill>
+                    <a:blip r:embed="rId133"/>
+                    <a:stretch>
+                      <a:fillRect/>
+                    </a:stretch>
+                  </pic:blipFill>
+                  <pic:spPr bwMode="auto">
+                    <a:xfrm>
+                      <a:off x="0" y="0"/>
+                      <a:ext cx="5227320" cy="1099937"/>
+                    </a:xfrm>
+                    <a:prstGeom prst="rect">
+                      <a:avLst/>
+                    </a:prstGeom>
+                    <a:noFill/>
+                    <a:ln w="9525">
+                      <a:noFill/>
+                      <a:headEnd/>
+                      <a:tailEnd/>
+                    </a:ln>
+                  </pic:spPr>
+                </pic:pic>
+              </a:graphicData>
+            </a:graphic>
+          </wp:inline>
+        </w:drawing>
+      </w:r>
+    </w:p>
+    <w:p>
+      <w:pPr>
+        <w:pStyle w:val="BodyText"/>
+      </w:pPr>
+      <w:r>
+        <w:rPr>
+          <w:b/>
+          <w:bCs/>
+        </w:rPr>
+        <w:t xml:space="preserve">Figure 5.</w:t>
+      </w:r>
+      <w:r>
+        <w:t xml:space="preserve"> </w:t>
+      </w:r>
+      <w:r>
+        <w:t xml:space="preserve">The document ingestion flow. The stable identifier makes re-ingesting the same file idempotent, replacing the old passages rather than duplicating them.</w:t>
+      </w:r>
+    </w:p>
+    <w:p>
+      <w:pPr>
+        <w:pStyle w:val="BodyText"/>
+      </w:pPr>
+      <w:r>
+        <w:drawing>
+          <wp:inline>
+            <wp:extent cx="5067300" cy="2289358"/>
+            <wp:effectExtent b="0" l="0" r="0" t="0"/>
+            <wp:docPr descr="" title="" id="137" name="Picture"/>
+            <a:graphic>
+              <a:graphicData uri="http://schemas.openxmlformats.org/drawingml/2006/picture">
+                <pic:pic>
+                  <pic:nvPicPr>
+                    <pic:cNvPr descr="figures/fig6_query.png" id="138" name="Picture"/>
+                    <pic:cNvPicPr>
+                      <a:picLocks noChangeArrowheads="1" noChangeAspect="1"/>
+                    </pic:cNvPicPr>
+                  </pic:nvPicPr>
+                  <pic:blipFill>
+                    <a:blip r:embed="rId136"/>
+                    <a:stretch>
+                      <a:fillRect/>
+                    </a:stretch>
+                  </pic:blipFill>
+                  <pic:spPr bwMode="auto">
+                    <a:xfrm>
+                      <a:off x="0" y="0"/>
+                      <a:ext cx="5067300" cy="2289358"/>
+                    </a:xfrm>
+                    <a:prstGeom prst="rect">
+                      <a:avLst/>
+                    </a:prstGeom>
+                    <a:noFill/>
+                    <a:ln w="9525">
+                      <a:noFill/>
+                      <a:headEnd/>
+                      <a:tailEnd/>
+                    </a:ln>
+                  </pic:spPr>
+                </pic:pic>
+              </a:graphicData>
+            </a:graphic>
+          </wp:inline>
+        </w:drawing>
+      </w:r>
+    </w:p>
+    <w:p>
+      <w:pPr>
+        <w:pStyle w:val="BodyText"/>
+      </w:pPr>
+      <w:r>
+        <w:rPr>
+          <w:b/>
+          <w:bCs/>
+        </w:rPr>
+        <w:t xml:space="preserve">Figure 6.</w:t>
+      </w:r>
+      <w:r>
+        <w:t xml:space="preserve"> </w:t>
+      </w:r>
+      <w:r>
+        <w:t xml:space="preserve">The question answering flow. The evidence gate is the branch between refusing and answering, and it is the part that had to be recalibrated when the embedder changed.</w:t>
+      </w:r>
+    </w:p>
+    <w:bookmarkEnd w:id="139"/>
+    <w:bookmarkStart w:id="140" w:name="appendix-i.-repository-and-artifacts"/>
+    <w:p>
+      <w:pPr>
+        <w:pStyle w:val="Heading1"/>
+      </w:pPr>
+      <w:r>
+        <w:t xml:space="preserve">Appendix I. Repository and artifacts</w:t>
+      </w:r>
+    </w:p>
+    <w:p>
+      <w:pPr>
+        <w:pStyle w:val="FirstParagraph"/>
+      </w:pPr>
+      <w:r>
+        <w:t xml:space="preserve">The code, the documentation, the evaluation data, and the recorded results are in the public repository at github.com/archit2501/advanced-rag-llm-app. The recorded runs referenced in Chapter 7 are stored as JSON in the evaluation folder: the default results, the retrieval comparison, and the two learned-embedding runs. The commit history follows the weekly progress in Chapter 5. This report and the accompanying presentation are in the deliverables folder.</w:t>
+      </w:r>
+    </w:p>
+    <w:bookmarkEnd w:id="140"/>
+    <w:bookmarkStart w:id="148" w:name="appendix-j.-daily-logbook"/>
+    <w:p>
+      <w:pPr>
+        <w:pStyle w:val="Heading1"/>
+      </w:pPr>
+      <w:r>
+        <w:t xml:space="preserve">Appendix J. Daily logbook</w:t>
+      </w:r>
+    </w:p>
+    <w:p>
+      <w:pPr>
+        <w:pStyle w:val="FirstParagraph"/>
+      </w:pPr>
+      <w:r>
+        <w:t xml:space="preserve">This is the day-level log I kept, condensed. I have left it plain and specific rather than tidying it into a narrative, because a logbook is more useful as a record of what actually happened on each day than as a story. The weekly chapter draws on these entries.</w:t>
+      </w:r>
+    </w:p>
+    <w:bookmarkStart w:id="141" w:name="week-1-1923-may"/>
     <w:p>
       <w:pPr>
         <w:pStyle w:val="Heading2"/>
       </w:pPr>
       <w:r>
-        <w:t xml:space="preserve">H.1 The pipeline</w:t>
-      </w:r>
-    </w:p>
-    <w:p>
-      <w:pPr>
-        <w:pStyle w:val="SourceCode"/>
-      </w:pPr>
-      <w:r>
-        <w:rPr>
-          <w:rStyle w:val="VerbatimChar"/>
-        </w:rPr>
-        <w:t xml:space="preserve">Configuration -&gt; Ingestion -&gt; Embeddings -&gt; Storage</w:t>
-      </w:r>
-      <w:r>
-        <w:br/>
-      </w:r>
-      <w:r>
-        <w:rPr>
-          <w:rStyle w:val="VerbatimChar"/>
-        </w:rPr>
-        <w:t xml:space="preserve">                                              |</w:t>
-      </w:r>
-      <w:r>
-        <w:br/>
-      </w:r>
-      <w:r>
-        <w:rPr>
-          <w:rStyle w:val="VerbatimChar"/>
-        </w:rPr>
-        <w:t xml:space="preserve">                       Question ---------&gt; Retrieval -&gt; Evidence gate</w:t>
-      </w:r>
-      <w:r>
-        <w:br/>
-      </w:r>
-      <w:r>
-        <w:rPr>
-          <w:rStyle w:val="VerbatimChar"/>
-        </w:rPr>
-        <w:t xml:space="preserve">                                                            |</w:t>
-      </w:r>
-      <w:r>
-        <w:br/>
-      </w:r>
-      <w:r>
-        <w:rPr>
-          <w:rStyle w:val="VerbatimChar"/>
-        </w:rPr>
-        <w:t xml:space="preserve">                                          refuse &lt;----------+----------&gt; Generation</w:t>
-      </w:r>
-      <w:r>
-        <w:br/>
-      </w:r>
-      <w:r>
-        <w:rPr>
-          <w:rStyle w:val="VerbatimChar"/>
-        </w:rPr>
-        <w:t xml:space="preserve">                                                                              |</w:t>
-      </w:r>
-      <w:r>
-        <w:br/>
-      </w:r>
-      <w:r>
-        <w:rPr>
-          <w:rStyle w:val="VerbatimChar"/>
-        </w:rPr>
-        <w:t xml:space="preserve">                                                          Citations &lt;---------+</w:t>
-      </w:r>
-      <w:r>
-        <w:br/>
-      </w:r>
-      <w:r>
-        <w:rPr>
-          <w:rStyle w:val="VerbatimChar"/>
-        </w:rPr>
-        <w:t xml:space="preserve">                                                                              |</w:t>
-      </w:r>
-      <w:r>
-        <w:br/>
-      </w:r>
-      <w:r>
-        <w:rPr>
-          <w:rStyle w:val="VerbatimChar"/>
-        </w:rPr>
-        <w:t xml:space="preserve">                                                       Answer + sources + diagnostics</w:t>
+        <w:t xml:space="preserve">Week 1 (19–23 May)</w:t>
       </w:r>
     </w:p>
     <w:p>
@@ -10246,37 +10776,49 @@
         <w:pStyle w:val="FirstParagraph"/>
       </w:pPr>
       <w:r>
-        <w:t xml:space="preserve">Figure H.1. The modules and how a request moves through them. Ingestion runs when a document is added; the question path runs when a question is asked.</w:t>
-      </w:r>
-    </w:p>
-    <w:bookmarkEnd w:id="112"/>
-    <w:bookmarkStart w:id="113" w:name="h.2-ingestion-flow"/>
+        <w:t xml:space="preserve">Monday: First meeting with my mentor. Spent it being talked out of writing code before I could state the problem in one sentence. Left with reading to do rather than a task.</w:t>
+      </w:r>
+    </w:p>
+    <w:p>
+      <w:pPr>
+        <w:pStyle w:val="BodyText"/>
+      </w:pPr>
+      <w:r>
+        <w:t xml:space="preserve">Tuesday: Read the RAG paper by Lewis and colleagues. Understood the shape, struggled with the retrieval background. Made a list of terms I did not know and started working through them.</w:t>
+      </w:r>
+    </w:p>
+    <w:p>
+      <w:pPr>
+        <w:pStyle w:val="BodyText"/>
+      </w:pPr>
+      <w:r>
+        <w:t xml:space="preserve">Wednesday: Read a BM25 survey and enough about embeddings to follow the rest. Set up the repository, the virtual environment, and the folder structure. Wrote the eight objectives on a sticky note.</w:t>
+      </w:r>
+    </w:p>
+    <w:p>
+      <w:pPr>
+        <w:pStyle w:val="BodyText"/>
+      </w:pPr>
+      <w:r>
+        <w:t xml:space="preserve">Thursday: Collected the sample documents and read them closely. Started listing the questions each document could and could not answer, which became the seed of the test set. Chose the stack after arguing myself out of a hosted vector database.</w:t>
+      </w:r>
+    </w:p>
+    <w:p>
+      <w:pPr>
+        <w:pStyle w:val="BodyText"/>
+      </w:pPr>
+      <w:r>
+        <w:t xml:space="preserve">Friday: Review with my mentor. Defended the one-sentence problem statement, including the clause about refusing when there is no answer. Did not yet understand how much that clause hid.</w:t>
+      </w:r>
+    </w:p>
+    <w:bookmarkEnd w:id="141"/>
+    <w:bookmarkStart w:id="142" w:name="week-2-2630-may"/>
     <w:p>
       <w:pPr>
         <w:pStyle w:val="Heading2"/>
       </w:pPr>
       <w:r>
-        <w:t xml:space="preserve">H.2 Ingestion flow</w:t>
-      </w:r>
-    </w:p>
-    <w:p>
-      <w:pPr>
-        <w:pStyle w:val="SourceCode"/>
-      </w:pPr>
-      <w:r>
-        <w:rPr>
-          <w:rStyle w:val="VerbatimChar"/>
-        </w:rPr>
-        <w:t xml:space="preserve">file bytes -&gt; extract text -&gt; normalise -&gt; stable identifier</w:t>
-      </w:r>
-      <w:r>
-        <w:br/>
-      </w:r>
-      <w:r>
-        <w:rPr>
-          <w:rStyle w:val="VerbatimChar"/>
-        </w:rPr>
-        <w:t xml:space="preserve">           -&gt; split into passages -&gt; embed each passage -&gt; store</w:t>
+        <w:t xml:space="preserve">Week 2 (26–30 May)</w:t>
       </w:r>
     </w:p>
     <w:p>
@@ -10284,55 +10826,49 @@
         <w:pStyle w:val="FirstParagraph"/>
       </w:pPr>
       <w:r>
-        <w:t xml:space="preserve">Figure H.2. What happens when a document is added. The stable identifier makes re-ingesting a file idempotent.</w:t>
-      </w:r>
-    </w:p>
-    <w:bookmarkEnd w:id="113"/>
-    <w:bookmarkStart w:id="114" w:name="h.3-query-flow"/>
+        <w:t xml:space="preserve">Monday: Wrote text extraction for plain formats, decoding as UTF-8 with replacement so one bad byte does not stop a batch. Added optional PDF extraction.</w:t>
+      </w:r>
+    </w:p>
+    <w:p>
+      <w:pPr>
+        <w:pStyle w:val="BodyText"/>
+      </w:pPr>
+      <w:r>
+        <w:t xml:space="preserve">Tuesday: Wrote normalisation for whitespace and control characters. First naive chunker that cut every 900 characters. It cut sentences in half; I could see immediately it was wrong.</w:t>
+      </w:r>
+    </w:p>
+    <w:p>
+      <w:pPr>
+        <w:pStyle w:val="BodyText"/>
+      </w:pPr>
+      <w:r>
+        <w:t xml:space="preserve">Wednesday: Second chunker that packs paragraphs and carries overlap. Much better on twelve of thirteen documents. The thirteenth had a single paragraph longer than the chunk size and produced one giant chunk.</w:t>
+      </w:r>
+    </w:p>
+    <w:p>
+      <w:pPr>
+        <w:pStyle w:val="BodyText"/>
+      </w:pPr>
+      <w:r>
+        <w:t xml:space="preserve">Thursday: Added the branch that splits an over-long paragraph on word boundaries. Wrote a chunking test with a deliberately over-long paragraph so the case is covered on purpose.</w:t>
+      </w:r>
+    </w:p>
+    <w:p>
+      <w:pPr>
+        <w:pStyle w:val="BodyText"/>
+      </w:pPr>
+      <w:r>
+        <w:t xml:space="preserve">Friday: Set up the SQLite schema and the insert logic, with content-derived identifiers so re-ingesting replaces rather than duplicates. Stored embeddings as JSON. Review: the interesting inputs are the ones you did not think of.</w:t>
+      </w:r>
+    </w:p>
+    <w:bookmarkEnd w:id="142"/>
+    <w:bookmarkStart w:id="143" w:name="week-3-26-june"/>
     <w:p>
       <w:pPr>
         <w:pStyle w:val="Heading2"/>
       </w:pPr>
       <w:r>
-        <w:t xml:space="preserve">H.3 Query flow</w:t>
-      </w:r>
-    </w:p>
-    <w:p>
-      <w:pPr>
-        <w:pStyle w:val="SourceCode"/>
-      </w:pPr>
-      <w:r>
-        <w:rPr>
-          <w:rStyle w:val="VerbatimChar"/>
-        </w:rPr>
-        <w:t xml:space="preserve">question -&gt; load passages -&gt; rank (keyword + vector, fused)</w:t>
-      </w:r>
-      <w:r>
-        <w:br/>
-      </w:r>
-      <w:r>
-        <w:rPr>
-          <w:rStyle w:val="VerbatimChar"/>
-        </w:rPr>
-        <w:t xml:space="preserve">         -&gt; evidence gate?</w:t>
-      </w:r>
-      <w:r>
-        <w:br/>
-      </w:r>
-      <w:r>
-        <w:rPr>
-          <w:rStyle w:val="VerbatimChar"/>
-        </w:rPr>
-        <w:t xml:space="preserve">              weak  -&gt; refusal message + diagnostics</w:t>
-      </w:r>
-      <w:r>
-        <w:br/>
-      </w:r>
-      <w:r>
-        <w:rPr>
-          <w:rStyle w:val="VerbatimChar"/>
-        </w:rPr>
-        <w:t xml:space="preserve">              ok    -&gt; generate -&gt; validate citations -&gt; answer + sources + diagnostics</w:t>
+        <w:t xml:space="preserve">Week 3 (2–6 June)</w:t>
       </w:r>
     </w:p>
     <w:p>
@@ -10340,18 +10876,256 @@
         <w:pStyle w:val="FirstParagraph"/>
       </w:pPr>
       <w:r>
-        <w:t xml:space="preserve">Figure H.3. What happens when a question is asked. The gate is the branch between refusing and answering, and it is the part that had to be recalibrated when the embedder changed.</w:t>
-      </w:r>
-    </w:p>
-    <w:bookmarkEnd w:id="114"/>
-    <w:bookmarkEnd w:id="115"/>
-    <w:bookmarkStart w:id="116" w:name="appendix-i.-repository-and-artifacts"/>
+        <w:t xml:space="preserve">Monday: Wrote the hashing embedder. Deterministic, offline, no model. Pleased with it. Wrote the tokeniser and stopword list.</w:t>
+      </w:r>
+    </w:p>
+    <w:p>
+      <w:pPr>
+        <w:pStyle w:val="BodyText"/>
+      </w:pPr>
+      <w:r>
+        <w:t xml:space="preserve">Tuesday: Implemented BM25 with the standard constants, and the RRF fusion with the overlap bonus. Sorted by fused score, took the top five. Wrote in my log that hybrid was clearly better.</w:t>
+      </w:r>
+    </w:p>
+    <w:p>
+      <w:pPr>
+        <w:pStyle w:val="BodyText"/>
+      </w:pPr>
+      <w:r>
+        <w:t xml:space="preserve">Wednesday: Review. My mentor asked what the vector search was matching on, given the embedder is a hash of tokens. Could not answer. Realised the vector signal was lexical, not semantic. A bad afternoon.</w:t>
+      </w:r>
+    </w:p>
+    <w:p>
+      <w:pPr>
+        <w:pStyle w:val="BodyText"/>
+      </w:pPr>
+      <w:r>
+        <w:t xml:space="preserve">Thursday: Wrote the honest version of my earlier log entry rather than deleting it. Decided the proper fix, a learned embedder, would wait until the pipeline was finished. Kept the hashing embedder as a legitimate default.</w:t>
+      </w:r>
+    </w:p>
+    <w:p>
+      <w:pPr>
+        <w:pStyle w:val="BodyText"/>
+      </w:pPr>
+      <w:r>
+        <w:t xml:space="preserve">Friday: Made every retrieval result carry its component scores and rank. Felt like over-engineering. It was not; it paid off in weeks five and six.</w:t>
+      </w:r>
+    </w:p>
+    <w:bookmarkEnd w:id="143"/>
+    <w:bookmarkStart w:id="144" w:name="week-4-913-june"/>
+    <w:p>
+      <w:pPr>
+        <w:pStyle w:val="Heading2"/>
+      </w:pPr>
+      <w:r>
+        <w:t xml:space="preserve">Week 4 (9–13 June)</w:t>
+      </w:r>
+    </w:p>
+    <w:p>
+      <w:pPr>
+        <w:pStyle w:val="FirstParagraph"/>
+      </w:pPr>
+      <w:r>
+        <w:t xml:space="preserve">Monday: Built the offline extractive answerer. It selects the best sentence per passage, takes up to three, and tags each with its source number.</w:t>
+      </w:r>
+    </w:p>
+    <w:p>
+      <w:pPr>
+        <w:pStyle w:val="BodyText"/>
+      </w:pPr>
+      <w:r>
+        <w:t xml:space="preserve">Tuesday: Wrote the OpenAI Responses adapter and the Ollama adapter behind the shared interface. Mocked the OpenAI client in a test so no real call is made.</w:t>
+      </w:r>
+    </w:p>
+    <w:p>
+      <w:pPr>
+        <w:pStyle w:val="BodyText"/>
+      </w:pPr>
+      <w:r>
+        <w:t xml:space="preserve">Wednesday: First evidence gate, a single threshold on the fused score. Refused too much. Rewrote it to require all four signals to be weak before refusing.</w:t>
+      </w:r>
+    </w:p>
+    <w:p>
+      <w:pPr>
+        <w:pStyle w:val="BodyText"/>
+      </w:pPr>
+      <w:r>
+        <w:t xml:space="preserve">Thursday: Tuned the four thresholds by running the unanswerable questions and adjusting until they were refused without refusing the answerable ones. Knew this was tuning on the test set and wrote a note that the thresholds were not real constants.</w:t>
+      </w:r>
+    </w:p>
+    <w:p>
+      <w:pPr>
+        <w:pStyle w:val="BodyText"/>
+      </w:pPr>
+      <w:r>
+        <w:t xml:space="preserve">Friday: Added the citation fallback that appended a citation when the model produced none. Thought it improved the interface. It made the coverage metric meaningless, and I did not notice for two weeks.</w:t>
+      </w:r>
+    </w:p>
+    <w:bookmarkEnd w:id="144"/>
+    <w:bookmarkStart w:id="145" w:name="week-5-1620-june"/>
+    <w:p>
+      <w:pPr>
+        <w:pStyle w:val="Heading2"/>
+      </w:pPr>
+      <w:r>
+        <w:t xml:space="preserve">Week 5 (16–20 June)</w:t>
+      </w:r>
+    </w:p>
+    <w:p>
+      <w:pPr>
+        <w:pStyle w:val="FirstParagraph"/>
+      </w:pPr>
+      <w:r>
+        <w:t xml:space="preserve">Monday: Built the API endpoints: health, list, clear, upload, ingest, ask, evaluate. FastAPI made the request and response shapes explicit.</w:t>
+      </w:r>
+    </w:p>
+    <w:p>
+      <w:pPr>
+        <w:pStyle w:val="BodyText"/>
+      </w:pPr>
+      <w:r>
+        <w:t xml:space="preserve">Tuesday: Built the frontend page. Made sure every server value is escaped before it goes into the page.</w:t>
+      </w:r>
+    </w:p>
+    <w:p>
+      <w:pPr>
+        <w:pStyle w:val="BodyText"/>
+      </w:pPr>
+      <w:r>
+        <w:t xml:space="preserve">Wednesday: Wrote the 41 test questions and labelled each with sources, facts, and a category. Deliberately included ambiguous, conflicting, and unanswerable cases.</w:t>
+      </w:r>
+    </w:p>
+    <w:p>
+      <w:pPr>
+        <w:pStyle w:val="BodyText"/>
+      </w:pPr>
+      <w:r>
+        <w:t xml:space="preserve">Thursday: Wrote the evaluation runner and ran it for the first time. Fact recall 0.8241, refused four of five unanswerable. Pleased, then wrote down every reason the numbers were softer than they looked.</w:t>
+      </w:r>
+    </w:p>
+    <w:p>
+      <w:pPr>
+        <w:pStyle w:val="BodyText"/>
+      </w:pPr>
+      <w:r>
+        <w:t xml:space="preserve">Friday: Wrote the browser test that drives the interface in a real Chromium browser and checks for console errors and layout overflow.</w:t>
+      </w:r>
+    </w:p>
+    <w:bookmarkEnd w:id="145"/>
+    <w:bookmarkStart w:id="146" w:name="week-6-2327-june"/>
+    <w:p>
+      <w:pPr>
+        <w:pStyle w:val="Heading2"/>
+      </w:pPr>
+      <w:r>
+        <w:t xml:space="preserve">Week 6 (23–27 June)</w:t>
+      </w:r>
+    </w:p>
+    <w:p>
+      <w:pPr>
+        <w:pStyle w:val="FirstParagraph"/>
+      </w:pPr>
+      <w:r>
+        <w:t xml:space="preserve">Monday: Wrote the retrieval comparison script for vector-only, keyword-only, and hybrid, with Recall, MRR, and nDCG.</w:t>
+      </w:r>
+    </w:p>
+    <w:p>
+      <w:pPr>
+        <w:pStyle w:val="BodyText"/>
+      </w:pPr>
+      <w:r>
+        <w:t xml:space="preserve">Tuesday: Ran it. Keyword-only had the best pure ranking; hybrid led only on the combined score because of abstention. Wrote that honestly instead of reporting</w:t>
+      </w:r>
+      <w:r>
+        <w:t xml:space="preserve"> </w:t>
+      </w:r>
+      <w:r>
+        <w:t xml:space="preserve">“hybrid wins.”</w:t>
+      </w:r>
+    </w:p>
+    <w:p>
+      <w:pPr>
+        <w:pStyle w:val="BodyText"/>
+      </w:pPr>
+      <w:r>
+        <w:t xml:space="preserve">Wednesday: Code review from another engineer. It found the fabricated citation, the wildcard cross-origin policy with credentials, dead code, a made-up model name, no upload limit, and unprotected destructive endpoints.</w:t>
+      </w:r>
+    </w:p>
+    <w:p>
+      <w:pPr>
+        <w:pStyle w:val="BodyText"/>
+      </w:pPr>
+      <w:r>
+        <w:t xml:space="preserve">Thursday: Fixed the review findings. Removed the fabricated citation and replaced it with a diagnostic flag. Set an explicit origin list. Added the upload limit. Deleted the dead code. Corrected the model name.</w:t>
+      </w:r>
+    </w:p>
+    <w:p>
+      <w:pPr>
+        <w:pStyle w:val="BodyText"/>
+      </w:pPr>
+      <w:r>
+        <w:t xml:space="preserve">Friday: Documented the unprotected endpoints as a stated limitation rather than pretending they were secure. Review: ask for a code review much earlier next time.</w:t>
+      </w:r>
+    </w:p>
+    <w:bookmarkEnd w:id="146"/>
+    <w:bookmarkStart w:id="147" w:name="week-7-30-june4-july"/>
+    <w:p>
+      <w:pPr>
+        <w:pStyle w:val="Heading2"/>
+      </w:pPr>
+      <w:r>
+        <w:t xml:space="preserve">Week 7 (30 June–4 July)</w:t>
+      </w:r>
+    </w:p>
+    <w:p>
+      <w:pPr>
+        <w:pStyle w:val="FirstParagraph"/>
+      </w:pPr>
+      <w:r>
+        <w:t xml:space="preserve">Monday: Added the sentence-transformer embedder behind the existing interface, guarded so the default install stays light. Made the embedder a single configuration value.</w:t>
+      </w:r>
+    </w:p>
+    <w:p>
+      <w:pPr>
+        <w:pStyle w:val="BodyText"/>
+      </w:pPr>
+      <w:r>
+        <w:t xml:space="preserve">Tuesday: Re-ran the comparison and evaluation with the learned embedder. Ranking improved. Fact recall slipped slightly. Refusal accuracy dropped to zero.</w:t>
+      </w:r>
+    </w:p>
+    <w:p>
+      <w:pPr>
+        <w:pStyle w:val="BodyText"/>
+      </w:pPr>
+      <w:r>
+        <w:t xml:space="preserve">Wednesday: Worked out why refusal collapsed: the thresholds were tuned to the old score scale. Reported the uncalibrated result rather than quietly re-tuning and hiding it.</w:t>
+      </w:r>
+    </w:p>
+    <w:p>
+      <w:pPr>
+        <w:pStyle w:val="BodyText"/>
+      </w:pPr>
+      <w:r>
+        <w:t xml:space="preserve">Thursday: Wrote the documentation and started this report. Found and fixed stale documentation that still described the old behaviour.</w:t>
+      </w:r>
+    </w:p>
+    <w:p>
+      <w:pPr>
+        <w:pStyle w:val="BodyText"/>
+      </w:pPr>
+      <w:r>
+        <w:t xml:space="preserve">Friday: Finished the report and the presentation. Cleaned the repository, checked once more for secrets, and pushed it public. Re-read the week-one sticky note; all eight objectives done.</w:t>
+      </w:r>
+    </w:p>
+    <w:bookmarkEnd w:id="147"/>
+    <w:bookmarkEnd w:id="148"/>
+    <w:bookmarkStart w:id="149" w:name="appendix-k.-worked-metric-calculations"/>
     <w:p>
       <w:pPr>
         <w:pStyle w:val="Heading1"/>
       </w:pPr>
       <w:r>
-        <w:t xml:space="preserve">Appendix I. Repository and artifacts</w:t>
+        <w:t xml:space="preserve">Appendix K. Worked metric calculations</w:t>
       </w:r>
     </w:p>
     <w:p>
@@ -10359,398 +11133,6 @@
         <w:pStyle w:val="FirstParagraph"/>
       </w:pPr>
       <w:r>
-        <w:t xml:space="preserve">The code, the documentation, the evaluation data, and the recorded results are in the public repository at github.com/archit2501/advanced-rag-llm-app. The recorded runs referenced in Chapter 7 are stored as JSON in the evaluation folder: the default results, the retrieval comparison, and the two learned-embedding runs. The commit history follows the weekly progress in Chapter 5. This report and the accompanying presentation are in the deliverables folder.</w:t>
-      </w:r>
-    </w:p>
-    <w:bookmarkEnd w:id="116"/>
-    <w:bookmarkStart w:id="124" w:name="appendix-j.-daily-logbook"/>
-    <w:p>
-      <w:pPr>
-        <w:pStyle w:val="Heading1"/>
-      </w:pPr>
-      <w:r>
-        <w:t xml:space="preserve">Appendix J. Daily logbook</w:t>
-      </w:r>
-    </w:p>
-    <w:p>
-      <w:pPr>
-        <w:pStyle w:val="FirstParagraph"/>
-      </w:pPr>
-      <w:r>
-        <w:t xml:space="preserve">This is the day-level log I kept, condensed. I have left it plain and specific rather than tidying it into a narrative, because a logbook is more useful as a record of what actually happened on each day than as a story. The weekly chapter draws on these entries.</w:t>
-      </w:r>
-    </w:p>
-    <w:bookmarkStart w:id="117" w:name="week-1-1923-may"/>
-    <w:p>
-      <w:pPr>
-        <w:pStyle w:val="Heading2"/>
-      </w:pPr>
-      <w:r>
-        <w:t xml:space="preserve">Week 1 (19–23 May)</w:t>
-      </w:r>
-    </w:p>
-    <w:p>
-      <w:pPr>
-        <w:pStyle w:val="FirstParagraph"/>
-      </w:pPr>
-      <w:r>
-        <w:t xml:space="preserve">Monday: First meeting with my mentor. Spent it being talked out of writing code before I could state the problem in one sentence. Left with reading to do rather than a task.</w:t>
-      </w:r>
-    </w:p>
-    <w:p>
-      <w:pPr>
-        <w:pStyle w:val="BodyText"/>
-      </w:pPr>
-      <w:r>
-        <w:t xml:space="preserve">Tuesday: Read the RAG paper by Lewis and colleagues. Understood the shape, struggled with the retrieval background. Made a list of terms I did not know and started working through them.</w:t>
-      </w:r>
-    </w:p>
-    <w:p>
-      <w:pPr>
-        <w:pStyle w:val="BodyText"/>
-      </w:pPr>
-      <w:r>
-        <w:t xml:space="preserve">Wednesday: Read a BM25 survey and enough about embeddings to follow the rest. Set up the repository, the virtual environment, and the folder structure. Wrote the eight objectives on a sticky note.</w:t>
-      </w:r>
-    </w:p>
-    <w:p>
-      <w:pPr>
-        <w:pStyle w:val="BodyText"/>
-      </w:pPr>
-      <w:r>
-        <w:t xml:space="preserve">Thursday: Collected the sample documents and read them closely. Started listing the questions each document could and could not answer, which became the seed of the test set. Chose the stack after arguing myself out of a hosted vector database.</w:t>
-      </w:r>
-    </w:p>
-    <w:p>
-      <w:pPr>
-        <w:pStyle w:val="BodyText"/>
-      </w:pPr>
-      <w:r>
-        <w:t xml:space="preserve">Friday: Review with my mentor. Defended the one-sentence problem statement, including the clause about refusing when there is no answer. Did not yet understand how much that clause hid.</w:t>
-      </w:r>
-    </w:p>
-    <w:bookmarkEnd w:id="117"/>
-    <w:bookmarkStart w:id="118" w:name="week-2-2630-may"/>
-    <w:p>
-      <w:pPr>
-        <w:pStyle w:val="Heading2"/>
-      </w:pPr>
-      <w:r>
-        <w:t xml:space="preserve">Week 2 (26–30 May)</w:t>
-      </w:r>
-    </w:p>
-    <w:p>
-      <w:pPr>
-        <w:pStyle w:val="FirstParagraph"/>
-      </w:pPr>
-      <w:r>
-        <w:t xml:space="preserve">Monday: Wrote text extraction for plain formats, decoding as UTF-8 with replacement so one bad byte does not stop a batch. Added optional PDF extraction.</w:t>
-      </w:r>
-    </w:p>
-    <w:p>
-      <w:pPr>
-        <w:pStyle w:val="BodyText"/>
-      </w:pPr>
-      <w:r>
-        <w:t xml:space="preserve">Tuesday: Wrote normalisation for whitespace and control characters. First naive chunker that cut every 900 characters. It cut sentences in half; I could see immediately it was wrong.</w:t>
-      </w:r>
-    </w:p>
-    <w:p>
-      <w:pPr>
-        <w:pStyle w:val="BodyText"/>
-      </w:pPr>
-      <w:r>
-        <w:t xml:space="preserve">Wednesday: Second chunker that packs paragraphs and carries overlap. Much better on twelve of thirteen documents. The thirteenth had a single paragraph longer than the chunk size and produced one giant chunk.</w:t>
-      </w:r>
-    </w:p>
-    <w:p>
-      <w:pPr>
-        <w:pStyle w:val="BodyText"/>
-      </w:pPr>
-      <w:r>
-        <w:t xml:space="preserve">Thursday: Added the branch that splits an over-long paragraph on word boundaries. Wrote a chunking test with a deliberately over-long paragraph so the case is covered on purpose.</w:t>
-      </w:r>
-    </w:p>
-    <w:p>
-      <w:pPr>
-        <w:pStyle w:val="BodyText"/>
-      </w:pPr>
-      <w:r>
-        <w:t xml:space="preserve">Friday: Set up the SQLite schema and the insert logic, with content-derived identifiers so re-ingesting replaces rather than duplicates. Stored embeddings as JSON. Review: the interesting inputs are the ones you did not think of.</w:t>
-      </w:r>
-    </w:p>
-    <w:bookmarkEnd w:id="118"/>
-    <w:bookmarkStart w:id="119" w:name="week-3-26-june"/>
-    <w:p>
-      <w:pPr>
-        <w:pStyle w:val="Heading2"/>
-      </w:pPr>
-      <w:r>
-        <w:t xml:space="preserve">Week 3 (2–6 June)</w:t>
-      </w:r>
-    </w:p>
-    <w:p>
-      <w:pPr>
-        <w:pStyle w:val="FirstParagraph"/>
-      </w:pPr>
-      <w:r>
-        <w:t xml:space="preserve">Monday: Wrote the hashing embedder. Deterministic, offline, no model. Pleased with it. Wrote the tokeniser and stopword list.</w:t>
-      </w:r>
-    </w:p>
-    <w:p>
-      <w:pPr>
-        <w:pStyle w:val="BodyText"/>
-      </w:pPr>
-      <w:r>
-        <w:t xml:space="preserve">Tuesday: Implemented BM25 with the standard constants, and the RRF fusion with the overlap bonus. Sorted by fused score, took the top five. Wrote in my log that hybrid was clearly better.</w:t>
-      </w:r>
-    </w:p>
-    <w:p>
-      <w:pPr>
-        <w:pStyle w:val="BodyText"/>
-      </w:pPr>
-      <w:r>
-        <w:t xml:space="preserve">Wednesday: Review. My mentor asked what the vector search was matching on, given the embedder is a hash of tokens. Could not answer. Realised the vector signal was lexical, not semantic. A bad afternoon.</w:t>
-      </w:r>
-    </w:p>
-    <w:p>
-      <w:pPr>
-        <w:pStyle w:val="BodyText"/>
-      </w:pPr>
-      <w:r>
-        <w:t xml:space="preserve">Thursday: Wrote the honest version of my earlier log entry rather than deleting it. Decided the proper fix, a learned embedder, would wait until the pipeline was finished. Kept the hashing embedder as a legitimate default.</w:t>
-      </w:r>
-    </w:p>
-    <w:p>
-      <w:pPr>
-        <w:pStyle w:val="BodyText"/>
-      </w:pPr>
-      <w:r>
-        <w:t xml:space="preserve">Friday: Made every retrieval result carry its component scores and rank. Felt like over-engineering. It was not; it paid off in weeks five and six.</w:t>
-      </w:r>
-    </w:p>
-    <w:bookmarkEnd w:id="119"/>
-    <w:bookmarkStart w:id="120" w:name="week-4-913-june"/>
-    <w:p>
-      <w:pPr>
-        <w:pStyle w:val="Heading2"/>
-      </w:pPr>
-      <w:r>
-        <w:t xml:space="preserve">Week 4 (9–13 June)</w:t>
-      </w:r>
-    </w:p>
-    <w:p>
-      <w:pPr>
-        <w:pStyle w:val="FirstParagraph"/>
-      </w:pPr>
-      <w:r>
-        <w:t xml:space="preserve">Monday: Built the offline extractive answerer. It selects the best sentence per passage, takes up to three, and tags each with its source number.</w:t>
-      </w:r>
-    </w:p>
-    <w:p>
-      <w:pPr>
-        <w:pStyle w:val="BodyText"/>
-      </w:pPr>
-      <w:r>
-        <w:t xml:space="preserve">Tuesday: Wrote the OpenAI Responses adapter and the Ollama adapter behind the shared interface. Mocked the OpenAI client in a test so no real call is made.</w:t>
-      </w:r>
-    </w:p>
-    <w:p>
-      <w:pPr>
-        <w:pStyle w:val="BodyText"/>
-      </w:pPr>
-      <w:r>
-        <w:t xml:space="preserve">Wednesday: First evidence gate, a single threshold on the fused score. Refused too much. Rewrote it to require all four signals to be weak before refusing.</w:t>
-      </w:r>
-    </w:p>
-    <w:p>
-      <w:pPr>
-        <w:pStyle w:val="BodyText"/>
-      </w:pPr>
-      <w:r>
-        <w:t xml:space="preserve">Thursday: Tuned the four thresholds by running the unanswerable questions and adjusting until they were refused without refusing the answerable ones. Knew this was tuning on the test set and wrote a note that the thresholds were not real constants.</w:t>
-      </w:r>
-    </w:p>
-    <w:p>
-      <w:pPr>
-        <w:pStyle w:val="BodyText"/>
-      </w:pPr>
-      <w:r>
-        <w:t xml:space="preserve">Friday: Added the citation fallback that appended a citation when the model produced none. Thought it improved the interface. It made the coverage metric meaningless, and I did not notice for two weeks.</w:t>
-      </w:r>
-    </w:p>
-    <w:bookmarkEnd w:id="120"/>
-    <w:bookmarkStart w:id="121" w:name="week-5-1620-june"/>
-    <w:p>
-      <w:pPr>
-        <w:pStyle w:val="Heading2"/>
-      </w:pPr>
-      <w:r>
-        <w:t xml:space="preserve">Week 5 (16–20 June)</w:t>
-      </w:r>
-    </w:p>
-    <w:p>
-      <w:pPr>
-        <w:pStyle w:val="FirstParagraph"/>
-      </w:pPr>
-      <w:r>
-        <w:t xml:space="preserve">Monday: Built the API endpoints: health, list, clear, upload, ingest, ask, evaluate. FastAPI made the request and response shapes explicit.</w:t>
-      </w:r>
-    </w:p>
-    <w:p>
-      <w:pPr>
-        <w:pStyle w:val="BodyText"/>
-      </w:pPr>
-      <w:r>
-        <w:t xml:space="preserve">Tuesday: Built the frontend page. Made sure every server value is escaped before it goes into the page.</w:t>
-      </w:r>
-    </w:p>
-    <w:p>
-      <w:pPr>
-        <w:pStyle w:val="BodyText"/>
-      </w:pPr>
-      <w:r>
-        <w:t xml:space="preserve">Wednesday: Wrote the 41 test questions and labelled each with sources, facts, and a category. Deliberately included ambiguous, conflicting, and unanswerable cases.</w:t>
-      </w:r>
-    </w:p>
-    <w:p>
-      <w:pPr>
-        <w:pStyle w:val="BodyText"/>
-      </w:pPr>
-      <w:r>
-        <w:t xml:space="preserve">Thursday: Wrote the evaluation runner and ran it for the first time. Fact recall 0.8241, refused four of five unanswerable. Pleased, then wrote down every reason the numbers were softer than they looked.</w:t>
-      </w:r>
-    </w:p>
-    <w:p>
-      <w:pPr>
-        <w:pStyle w:val="BodyText"/>
-      </w:pPr>
-      <w:r>
-        <w:t xml:space="preserve">Friday: Wrote the browser test that drives the interface in a real Chromium browser and checks for console errors and layout overflow.</w:t>
-      </w:r>
-    </w:p>
-    <w:bookmarkEnd w:id="121"/>
-    <w:bookmarkStart w:id="122" w:name="week-6-2327-june"/>
-    <w:p>
-      <w:pPr>
-        <w:pStyle w:val="Heading2"/>
-      </w:pPr>
-      <w:r>
-        <w:t xml:space="preserve">Week 6 (23–27 June)</w:t>
-      </w:r>
-    </w:p>
-    <w:p>
-      <w:pPr>
-        <w:pStyle w:val="FirstParagraph"/>
-      </w:pPr>
-      <w:r>
-        <w:t xml:space="preserve">Monday: Wrote the retrieval comparison script for vector-only, keyword-only, and hybrid, with Recall, MRR, and nDCG.</w:t>
-      </w:r>
-    </w:p>
-    <w:p>
-      <w:pPr>
-        <w:pStyle w:val="BodyText"/>
-      </w:pPr>
-      <w:r>
-        <w:t xml:space="preserve">Tuesday: Ran it. Keyword-only had the best pure ranking; hybrid led only on the combined score because of abstention. Wrote that honestly instead of reporting</w:t>
-      </w:r>
-      <w:r>
-        <w:t xml:space="preserve"> </w:t>
-      </w:r>
-      <w:r>
-        <w:t xml:space="preserve">“hybrid wins.”</w:t>
-      </w:r>
-    </w:p>
-    <w:p>
-      <w:pPr>
-        <w:pStyle w:val="BodyText"/>
-      </w:pPr>
-      <w:r>
-        <w:t xml:space="preserve">Wednesday: Code review from another engineer. It found the fabricated citation, the wildcard cross-origin policy with credentials, dead code, a made-up model name, no upload limit, and unprotected destructive endpoints.</w:t>
-      </w:r>
-    </w:p>
-    <w:p>
-      <w:pPr>
-        <w:pStyle w:val="BodyText"/>
-      </w:pPr>
-      <w:r>
-        <w:t xml:space="preserve">Thursday: Fixed the review findings. Removed the fabricated citation and replaced it with a diagnostic flag. Set an explicit origin list. Added the upload limit. Deleted the dead code. Corrected the model name.</w:t>
-      </w:r>
-    </w:p>
-    <w:p>
-      <w:pPr>
-        <w:pStyle w:val="BodyText"/>
-      </w:pPr>
-      <w:r>
-        <w:t xml:space="preserve">Friday: Documented the unprotected endpoints as a stated limitation rather than pretending they were secure. Review: ask for a code review much earlier next time.</w:t>
-      </w:r>
-    </w:p>
-    <w:bookmarkEnd w:id="122"/>
-    <w:bookmarkStart w:id="123" w:name="week-7-30-june4-july"/>
-    <w:p>
-      <w:pPr>
-        <w:pStyle w:val="Heading2"/>
-      </w:pPr>
-      <w:r>
-        <w:t xml:space="preserve">Week 7 (30 June–4 July)</w:t>
-      </w:r>
-    </w:p>
-    <w:p>
-      <w:pPr>
-        <w:pStyle w:val="FirstParagraph"/>
-      </w:pPr>
-      <w:r>
-        <w:t xml:space="preserve">Monday: Added the sentence-transformer embedder behind the existing interface, guarded so the default install stays light. Made the embedder a single configuration value.</w:t>
-      </w:r>
-    </w:p>
-    <w:p>
-      <w:pPr>
-        <w:pStyle w:val="BodyText"/>
-      </w:pPr>
-      <w:r>
-        <w:t xml:space="preserve">Tuesday: Re-ran the comparison and evaluation with the learned embedder. Ranking improved. Fact recall slipped slightly. Refusal accuracy dropped to zero.</w:t>
-      </w:r>
-    </w:p>
-    <w:p>
-      <w:pPr>
-        <w:pStyle w:val="BodyText"/>
-      </w:pPr>
-      <w:r>
-        <w:t xml:space="preserve">Wednesday: Worked out why refusal collapsed: the thresholds were tuned to the old score scale. Reported the uncalibrated result rather than quietly re-tuning and hiding it.</w:t>
-      </w:r>
-    </w:p>
-    <w:p>
-      <w:pPr>
-        <w:pStyle w:val="BodyText"/>
-      </w:pPr>
-      <w:r>
-        <w:t xml:space="preserve">Thursday: Wrote the documentation and started this report. Found and fixed stale documentation that still described the old behaviour.</w:t>
-      </w:r>
-    </w:p>
-    <w:p>
-      <w:pPr>
-        <w:pStyle w:val="BodyText"/>
-      </w:pPr>
-      <w:r>
-        <w:t xml:space="preserve">Friday: Finished the report and the presentation. Cleaned the repository, checked once more for secrets, and pushed it public. Re-read the week-one sticky note; all eight objectives done.</w:t>
-      </w:r>
-    </w:p>
-    <w:bookmarkEnd w:id="123"/>
-    <w:bookmarkEnd w:id="124"/>
-    <w:bookmarkStart w:id="125" w:name="appendix-k.-worked-metric-calculations"/>
-    <w:p>
-      <w:pPr>
-        <w:pStyle w:val="Heading1"/>
-      </w:pPr>
-      <w:r>
-        <w:t xml:space="preserve">Appendix K. Worked metric calculations</w:t>
-      </w:r>
-    </w:p>
-    <w:p>
-      <w:pPr>
-        <w:pStyle w:val="FirstParagraph"/>
-      </w:pPr>
-      <w:r>
         <w:t xml:space="preserve">The retrieval metrics in Chapter 7 are standard, but they are easier to trust if you can compute them by hand on a small example. Suppose for one question the correct source is document D, and the system’s ranked list of unique sources is E, D, F, so the correct source is in second place.</w:t>
       </w:r>
     </w:p>
@@ -10786,7 +11168,7 @@
         <w:t xml:space="preserve">Doing this by hand once made the comparison table in Chapter 7 much less abstract. It also made clear why a system can have perfect Recall at 5 and a mediocre nDCG at the same time: getting the right source into the top five is easier than getting it to the top, and the two metrics measure those two different things.</w:t>
       </w:r>
     </w:p>
-    <w:bookmarkEnd w:id="125"/>
+    <w:bookmarkEnd w:id="149"/>
     <w:sectPr>
       <w:footnotePr>
         <w:numRestart w:val="eachSect"/>

</xml_diff>